<commit_message>
finished module 01 javascript
</commit_message>
<xml_diff>
--- a/Module_01_js.docx
+++ b/Module_01_js.docx
@@ -132,12 +132,14 @@
               <w:lang w:val="es-ES"/>
             </w:rPr>
           </w:pPr>
+          <w:proofErr w:type="spellStart"/>
           <w:r>
             <w:rPr>
               <w:lang w:val="es-ES"/>
             </w:rPr>
             <w:t>Contents</w:t>
           </w:r>
+          <w:proofErr w:type="spellEnd"/>
         </w:p>
         <w:p>
           <w:pPr>
@@ -162,7 +164,7 @@
           <w:r>
             <w:fldChar w:fldCharType="separate"/>
           </w:r>
-          <w:hyperlink w:anchor="_Toc227989460" w:history="1">
+          <w:hyperlink w:anchor="_Toc233887107" w:history="1">
             <w:r>
               <w:rPr>
                 <w:rStyle w:val="Hipervnculo"/>
@@ -190,7 +192,7 @@
                 <w:noProof/>
                 <w:webHidden/>
               </w:rPr>
-              <w:instrText xml:space="preserve"> PAGEREF _Toc227989460 \h </w:instrText>
+              <w:instrText xml:space="preserve"> PAGEREF _Toc233887107 \h </w:instrText>
             </w:r>
             <w:r>
               <w:rPr>
@@ -232,14 +234,30 @@
               <w:noProof/>
             </w:rPr>
           </w:pPr>
-          <w:hyperlink w:anchor="_Toc227989461" w:history="1">
+          <w:hyperlink w:anchor="_Toc233887108" w:history="1">
             <w:r>
               <w:rPr>
                 <w:rStyle w:val="Hipervnculo"/>
                 <w:noProof/>
                 <w:lang w:val="es-ES"/>
               </w:rPr>
-              <w:t>II. Introducción</w:t>
+              <w:t>II. Introducc</w:t>
+            </w:r>
+            <w:r>
+              <w:rPr>
+                <w:rStyle w:val="Hipervnculo"/>
+                <w:noProof/>
+                <w:lang w:val="es-ES"/>
+              </w:rPr>
+              <w:t>i</w:t>
+            </w:r>
+            <w:r>
+              <w:rPr>
+                <w:rStyle w:val="Hipervnculo"/>
+                <w:noProof/>
+                <w:lang w:val="es-ES"/>
+              </w:rPr>
+              <w:t>ón</w:t>
             </w:r>
             <w:r>
               <w:rPr>
@@ -260,7 +278,7 @@
                 <w:noProof/>
                 <w:webHidden/>
               </w:rPr>
-              <w:instrText xml:space="preserve"> PAGEREF _Toc227989461 \h </w:instrText>
+              <w:instrText xml:space="preserve"> PAGEREF _Toc233887108 \h </w:instrText>
             </w:r>
             <w:r>
               <w:rPr>
@@ -293,531 +311,6 @@
         </w:p>
         <w:p>
           <w:pPr>
-            <w:pStyle w:val="TDC3"/>
-            <w:tabs>
-              <w:tab w:val="right" w:leader="dot" w:pos="8828"/>
-            </w:tabs>
-            <w:rPr>
-              <w:rFonts w:eastAsiaTheme="minorEastAsia"/>
-              <w:noProof/>
-            </w:rPr>
-          </w:pPr>
-          <w:hyperlink w:anchor="_Toc227989462" w:history="1">
-            <w:r>
-              <w:rPr>
-                <w:rStyle w:val="Hipervnculo"/>
-                <w:noProof/>
-                <w:lang w:val="es-ES"/>
-              </w:rPr>
-              <w:t xml:space="preserve">V. Ejercicio </w:t>
-            </w:r>
-            <w:r>
-              <w:rPr>
-                <w:rStyle w:val="Hipervnculo"/>
-                <w:bCs/>
-                <w:noProof/>
-                <w:lang w:val="es-ES"/>
-              </w:rPr>
-              <w:t>00: El Registro del Cultivo</w:t>
-            </w:r>
-            <w:r>
-              <w:rPr>
-                <w:noProof/>
-                <w:webHidden/>
-              </w:rPr>
-              <w:tab/>
-            </w:r>
-            <w:r>
-              <w:rPr>
-                <w:noProof/>
-                <w:webHidden/>
-              </w:rPr>
-              <w:fldChar w:fldCharType="begin"/>
-            </w:r>
-            <w:r>
-              <w:rPr>
-                <w:noProof/>
-                <w:webHidden/>
-              </w:rPr>
-              <w:instrText xml:space="preserve"> PAGEREF _Toc227989462 \h </w:instrText>
-            </w:r>
-            <w:r>
-              <w:rPr>
-                <w:noProof/>
-                <w:webHidden/>
-              </w:rPr>
-            </w:r>
-            <w:r>
-              <w:rPr>
-                <w:noProof/>
-                <w:webHidden/>
-              </w:rPr>
-              <w:fldChar w:fldCharType="separate"/>
-            </w:r>
-            <w:r>
-              <w:rPr>
-                <w:noProof/>
-                <w:webHidden/>
-              </w:rPr>
-              <w:t>6</w:t>
-            </w:r>
-            <w:r>
-              <w:rPr>
-                <w:noProof/>
-                <w:webHidden/>
-              </w:rPr>
-              <w:fldChar w:fldCharType="end"/>
-            </w:r>
-          </w:hyperlink>
-        </w:p>
-        <w:p>
-          <w:pPr>
-            <w:pStyle w:val="TDC3"/>
-            <w:tabs>
-              <w:tab w:val="right" w:leader="dot" w:pos="8828"/>
-            </w:tabs>
-            <w:rPr>
-              <w:rFonts w:eastAsiaTheme="minorEastAsia"/>
-              <w:noProof/>
-            </w:rPr>
-          </w:pPr>
-          <w:hyperlink w:anchor="_Toc227989463" w:history="1">
-            <w:r>
-              <w:rPr>
-                <w:rStyle w:val="Hipervnculo"/>
-                <w:noProof/>
-                <w:lang w:val="es-ES"/>
-              </w:rPr>
-              <w:t xml:space="preserve">VI. Ejercicio 01: </w:t>
-            </w:r>
-            <w:r>
-              <w:rPr>
-                <w:rStyle w:val="Hipervnculo"/>
-                <w:bCs/>
-                <w:noProof/>
-                <w:lang w:val="es-ES"/>
-              </w:rPr>
-              <w:t>El Inventario Dinámico</w:t>
-            </w:r>
-            <w:r>
-              <w:rPr>
-                <w:noProof/>
-                <w:webHidden/>
-              </w:rPr>
-              <w:tab/>
-            </w:r>
-            <w:r>
-              <w:rPr>
-                <w:noProof/>
-                <w:webHidden/>
-              </w:rPr>
-              <w:fldChar w:fldCharType="begin"/>
-            </w:r>
-            <w:r>
-              <w:rPr>
-                <w:noProof/>
-                <w:webHidden/>
-              </w:rPr>
-              <w:instrText xml:space="preserve"> PAGEREF _Toc227989463 \h </w:instrText>
-            </w:r>
-            <w:r>
-              <w:rPr>
-                <w:noProof/>
-                <w:webHidden/>
-              </w:rPr>
-            </w:r>
-            <w:r>
-              <w:rPr>
-                <w:noProof/>
-                <w:webHidden/>
-              </w:rPr>
-              <w:fldChar w:fldCharType="separate"/>
-            </w:r>
-            <w:r>
-              <w:rPr>
-                <w:noProof/>
-                <w:webHidden/>
-              </w:rPr>
-              <w:t>7</w:t>
-            </w:r>
-            <w:r>
-              <w:rPr>
-                <w:noProof/>
-                <w:webHidden/>
-              </w:rPr>
-              <w:fldChar w:fldCharType="end"/>
-            </w:r>
-          </w:hyperlink>
-        </w:p>
-        <w:p>
-          <w:pPr>
-            <w:pStyle w:val="TDC3"/>
-            <w:tabs>
-              <w:tab w:val="right" w:leader="dot" w:pos="8828"/>
-            </w:tabs>
-            <w:rPr>
-              <w:rFonts w:eastAsiaTheme="minorEastAsia"/>
-              <w:noProof/>
-            </w:rPr>
-          </w:pPr>
-          <w:hyperlink w:anchor="_Toc227989464" w:history="1">
-            <w:r>
-              <w:rPr>
-                <w:rStyle w:val="Hipervnculo"/>
-                <w:noProof/>
-                <w:lang w:val="es-ES"/>
-              </w:rPr>
-              <w:t>VII. Ejercicio 02: La Línea del Tiempo</w:t>
-            </w:r>
-            <w:r>
-              <w:rPr>
-                <w:noProof/>
-                <w:webHidden/>
-              </w:rPr>
-              <w:tab/>
-            </w:r>
-            <w:r>
-              <w:rPr>
-                <w:noProof/>
-                <w:webHidden/>
-              </w:rPr>
-              <w:fldChar w:fldCharType="begin"/>
-            </w:r>
-            <w:r>
-              <w:rPr>
-                <w:noProof/>
-                <w:webHidden/>
-              </w:rPr>
-              <w:instrText xml:space="preserve"> PAGEREF _Toc227989464 \h </w:instrText>
-            </w:r>
-            <w:r>
-              <w:rPr>
-                <w:noProof/>
-                <w:webHidden/>
-              </w:rPr>
-            </w:r>
-            <w:r>
-              <w:rPr>
-                <w:noProof/>
-                <w:webHidden/>
-              </w:rPr>
-              <w:fldChar w:fldCharType="separate"/>
-            </w:r>
-            <w:r>
-              <w:rPr>
-                <w:noProof/>
-                <w:webHidden/>
-              </w:rPr>
-              <w:t>8</w:t>
-            </w:r>
-            <w:r>
-              <w:rPr>
-                <w:noProof/>
-                <w:webHidden/>
-              </w:rPr>
-              <w:fldChar w:fldCharType="end"/>
-            </w:r>
-          </w:hyperlink>
-        </w:p>
-        <w:p>
-          <w:pPr>
-            <w:pStyle w:val="TDC3"/>
-            <w:tabs>
-              <w:tab w:val="right" w:leader="dot" w:pos="8828"/>
-            </w:tabs>
-            <w:rPr>
-              <w:rFonts w:eastAsiaTheme="minorEastAsia"/>
-              <w:noProof/>
-            </w:rPr>
-          </w:pPr>
-          <w:hyperlink w:anchor="_Toc227989465" w:history="1">
-            <w:r>
-              <w:rPr>
-                <w:rStyle w:val="Hipervnculo"/>
-                <w:noProof/>
-                <w:lang w:val="es-ES"/>
-              </w:rPr>
-              <w:t xml:space="preserve">VIII. Ejercicio 03: </w:t>
-            </w:r>
-            <w:r>
-              <w:rPr>
-                <w:rStyle w:val="Hipervnculo"/>
-                <w:bCs/>
-                <w:noProof/>
-                <w:lang w:val="es-ES"/>
-              </w:rPr>
-              <w:t>El Buscador de Semillas</w:t>
-            </w:r>
-            <w:r>
-              <w:rPr>
-                <w:noProof/>
-                <w:webHidden/>
-              </w:rPr>
-              <w:tab/>
-            </w:r>
-            <w:r>
-              <w:rPr>
-                <w:noProof/>
-                <w:webHidden/>
-              </w:rPr>
-              <w:fldChar w:fldCharType="begin"/>
-            </w:r>
-            <w:r>
-              <w:rPr>
-                <w:noProof/>
-                <w:webHidden/>
-              </w:rPr>
-              <w:instrText xml:space="preserve"> PAGEREF _Toc227989465 \h </w:instrText>
-            </w:r>
-            <w:r>
-              <w:rPr>
-                <w:noProof/>
-                <w:webHidden/>
-              </w:rPr>
-            </w:r>
-            <w:r>
-              <w:rPr>
-                <w:noProof/>
-                <w:webHidden/>
-              </w:rPr>
-              <w:fldChar w:fldCharType="separate"/>
-            </w:r>
-            <w:r>
-              <w:rPr>
-                <w:noProof/>
-                <w:webHidden/>
-              </w:rPr>
-              <w:t>9</w:t>
-            </w:r>
-            <w:r>
-              <w:rPr>
-                <w:noProof/>
-                <w:webHidden/>
-              </w:rPr>
-              <w:fldChar w:fldCharType="end"/>
-            </w:r>
-          </w:hyperlink>
-        </w:p>
-        <w:p>
-          <w:pPr>
-            <w:pStyle w:val="TDC3"/>
-            <w:tabs>
-              <w:tab w:val="right" w:leader="dot" w:pos="8828"/>
-            </w:tabs>
-            <w:rPr>
-              <w:rFonts w:eastAsiaTheme="minorEastAsia"/>
-              <w:noProof/>
-            </w:rPr>
-          </w:pPr>
-          <w:hyperlink w:anchor="_Toc227989466" w:history="1">
-            <w:r>
-              <w:rPr>
-                <w:rStyle w:val="Hipervnculo"/>
-                <w:noProof/>
-                <w:lang w:val="es-ES"/>
-              </w:rPr>
-              <w:t xml:space="preserve">IX. Ejercicio 04: </w:t>
-            </w:r>
-            <w:r>
-              <w:rPr>
-                <w:rStyle w:val="Hipervnculo"/>
-                <w:bCs/>
-                <w:noProof/>
-                <w:lang w:val="es-ES"/>
-              </w:rPr>
-              <w:t>El Transformador de Datos</w:t>
-            </w:r>
-            <w:r>
-              <w:rPr>
-                <w:noProof/>
-                <w:webHidden/>
-              </w:rPr>
-              <w:tab/>
-            </w:r>
-            <w:r>
-              <w:rPr>
-                <w:noProof/>
-                <w:webHidden/>
-              </w:rPr>
-              <w:fldChar w:fldCharType="begin"/>
-            </w:r>
-            <w:r>
-              <w:rPr>
-                <w:noProof/>
-                <w:webHidden/>
-              </w:rPr>
-              <w:instrText xml:space="preserve"> PAGEREF _Toc227989466 \h </w:instrText>
-            </w:r>
-            <w:r>
-              <w:rPr>
-                <w:noProof/>
-                <w:webHidden/>
-              </w:rPr>
-            </w:r>
-            <w:r>
-              <w:rPr>
-                <w:noProof/>
-                <w:webHidden/>
-              </w:rPr>
-              <w:fldChar w:fldCharType="separate"/>
-            </w:r>
-            <w:r>
-              <w:rPr>
-                <w:noProof/>
-                <w:webHidden/>
-              </w:rPr>
-              <w:t>10</w:t>
-            </w:r>
-            <w:r>
-              <w:rPr>
-                <w:noProof/>
-                <w:webHidden/>
-              </w:rPr>
-              <w:fldChar w:fldCharType="end"/>
-            </w:r>
-          </w:hyperlink>
-        </w:p>
-        <w:p>
-          <w:pPr>
-            <w:pStyle w:val="TDC3"/>
-            <w:tabs>
-              <w:tab w:val="right" w:leader="dot" w:pos="8828"/>
-            </w:tabs>
-            <w:rPr>
-              <w:rFonts w:eastAsiaTheme="minorEastAsia"/>
-              <w:noProof/>
-            </w:rPr>
-          </w:pPr>
-          <w:hyperlink w:anchor="_Toc227989467" w:history="1">
-            <w:r>
-              <w:rPr>
-                <w:rStyle w:val="Hipervnculo"/>
-                <w:noProof/>
-                <w:lang w:val="es-ES"/>
-              </w:rPr>
-              <w:t>X. Ejercicio 05: El Procesador Compacto (Arrow Power)</w:t>
-            </w:r>
-            <w:r>
-              <w:rPr>
-                <w:noProof/>
-                <w:webHidden/>
-              </w:rPr>
-              <w:tab/>
-            </w:r>
-            <w:r>
-              <w:rPr>
-                <w:noProof/>
-                <w:webHidden/>
-              </w:rPr>
-              <w:fldChar w:fldCharType="begin"/>
-            </w:r>
-            <w:r>
-              <w:rPr>
-                <w:noProof/>
-                <w:webHidden/>
-              </w:rPr>
-              <w:instrText xml:space="preserve"> PAGEREF _Toc227989467 \h </w:instrText>
-            </w:r>
-            <w:r>
-              <w:rPr>
-                <w:noProof/>
-                <w:webHidden/>
-              </w:rPr>
-            </w:r>
-            <w:r>
-              <w:rPr>
-                <w:noProof/>
-                <w:webHidden/>
-              </w:rPr>
-              <w:fldChar w:fldCharType="separate"/>
-            </w:r>
-            <w:r>
-              <w:rPr>
-                <w:noProof/>
-                <w:webHidden/>
-              </w:rPr>
-              <w:t>11</w:t>
-            </w:r>
-            <w:r>
-              <w:rPr>
-                <w:noProof/>
-                <w:webHidden/>
-              </w:rPr>
-              <w:fldChar w:fldCharType="end"/>
-            </w:r>
-          </w:hyperlink>
-        </w:p>
-        <w:p>
-          <w:pPr>
-            <w:pStyle w:val="TDC3"/>
-            <w:tabs>
-              <w:tab w:val="right" w:leader="dot" w:pos="8828"/>
-            </w:tabs>
-            <w:rPr>
-              <w:rFonts w:eastAsiaTheme="minorEastAsia"/>
-              <w:noProof/>
-            </w:rPr>
-          </w:pPr>
-          <w:hyperlink w:anchor="_Toc227989468" w:history="1">
-            <w:r>
-              <w:rPr>
-                <w:rStyle w:val="Hipervnculo"/>
-                <w:noProof/>
-              </w:rPr>
-              <w:t>XI. RETO NODE.JS: "The Local Database"</w:t>
-            </w:r>
-            <w:r>
-              <w:rPr>
-                <w:noProof/>
-                <w:webHidden/>
-              </w:rPr>
-              <w:tab/>
-            </w:r>
-            <w:r>
-              <w:rPr>
-                <w:noProof/>
-                <w:webHidden/>
-              </w:rPr>
-              <w:fldChar w:fldCharType="begin"/>
-            </w:r>
-            <w:r>
-              <w:rPr>
-                <w:noProof/>
-                <w:webHidden/>
-              </w:rPr>
-              <w:instrText xml:space="preserve"> PAGEREF _Toc227989468 \h </w:instrText>
-            </w:r>
-            <w:r>
-              <w:rPr>
-                <w:noProof/>
-                <w:webHidden/>
-              </w:rPr>
-            </w:r>
-            <w:r>
-              <w:rPr>
-                <w:noProof/>
-                <w:webHidden/>
-              </w:rPr>
-              <w:fldChar w:fldCharType="separate"/>
-            </w:r>
-            <w:r>
-              <w:rPr>
-                <w:noProof/>
-                <w:webHidden/>
-              </w:rPr>
-              <w:t>12</w:t>
-            </w:r>
-            <w:r>
-              <w:rPr>
-                <w:noProof/>
-                <w:webHidden/>
-              </w:rPr>
-              <w:fldChar w:fldCharType="end"/>
-            </w:r>
-          </w:hyperlink>
-        </w:p>
-        <w:p>
-          <w:pPr>
             <w:rPr>
               <w:lang w:val="es-ES"/>
             </w:rPr>
@@ -940,7 +433,49 @@
         <w:rPr>
           <w:lang w:val="es-ES"/>
         </w:rPr>
-        <w:t>El código debe ejecutarse en el entorno de Node.js (no dependas de APIs exclusivas de navegador como alert o window).</w:t>
+        <w:t xml:space="preserve">El código debe ejecutarse en el entorno de Node.js (no dependas de </w:t>
+      </w:r>
+      <w:proofErr w:type="spellStart"/>
+      <w:r>
+        <w:rPr>
+          <w:lang w:val="es-ES"/>
+        </w:rPr>
+        <w:t>APIs</w:t>
+      </w:r>
+      <w:proofErr w:type="spellEnd"/>
+      <w:r>
+        <w:rPr>
+          <w:lang w:val="es-ES"/>
+        </w:rPr>
+        <w:t xml:space="preserve"> exclusivas de navegador como </w:t>
+      </w:r>
+      <w:proofErr w:type="spellStart"/>
+      <w:r>
+        <w:rPr>
+          <w:lang w:val="es-ES"/>
+        </w:rPr>
+        <w:t>alert</w:t>
+      </w:r>
+      <w:proofErr w:type="spellEnd"/>
+      <w:r>
+        <w:rPr>
+          <w:lang w:val="es-ES"/>
+        </w:rPr>
+        <w:t xml:space="preserve"> o </w:t>
+      </w:r>
+      <w:proofErr w:type="spellStart"/>
+      <w:r>
+        <w:rPr>
+          <w:lang w:val="es-ES"/>
+        </w:rPr>
+        <w:t>window</w:t>
+      </w:r>
+      <w:proofErr w:type="spellEnd"/>
+      <w:r>
+        <w:rPr>
+          <w:lang w:val="es-ES"/>
+        </w:rPr>
+        <w:t>).</w:t>
       </w:r>
     </w:p>
     <w:p>
@@ -974,7 +509,21 @@
         <w:rPr>
           <w:lang w:val="es-ES"/>
         </w:rPr>
-        <w:t>Un archivo .js por ejercicio. Cada archivo debe contener la función solicitada (y sus funciones auxiliares si fueran necesarias).</w:t>
+        <w:t>Un archivo .</w:t>
+      </w:r>
+      <w:proofErr w:type="spellStart"/>
+      <w:r>
+        <w:rPr>
+          <w:lang w:val="es-ES"/>
+        </w:rPr>
+        <w:t>js</w:t>
+      </w:r>
+      <w:proofErr w:type="spellEnd"/>
+      <w:r>
+        <w:rPr>
+          <w:lang w:val="es-ES"/>
+        </w:rPr>
+        <w:t xml:space="preserve"> por ejercicio. Cada archivo debe contener la función solicitada (y sus funciones auxiliares si fueran necesarias).</w:t>
       </w:r>
     </w:p>
     <w:p>
@@ -988,6 +537,7 @@
           <w:lang w:val="es-ES"/>
         </w:rPr>
       </w:pPr>
+      <w:proofErr w:type="spellStart"/>
       <w:r>
         <w:rPr>
           <w:b/>
@@ -996,7 +546,18 @@
           <w:iCs/>
           <w:lang w:val="es-ES"/>
         </w:rPr>
-        <w:t>Linter Obligatorio:</w:t>
+        <w:t>Linter</w:t>
+      </w:r>
+      <w:proofErr w:type="spellEnd"/>
+      <w:r>
+        <w:rPr>
+          <w:b/>
+          <w:bCs/>
+          <w:i/>
+          <w:iCs/>
+          <w:lang w:val="es-ES"/>
+        </w:rPr>
+        <w:t xml:space="preserve"> Obligatorio:</w:t>
       </w:r>
       <w:r>
         <w:rPr>
@@ -1004,11 +565,19 @@
         </w:rPr>
         <w:t xml:space="preserve"> </w:t>
       </w:r>
-      <w:r>
-        <w:rPr>
-          <w:lang w:val="es-ES"/>
-        </w:rPr>
-        <w:t>ESLint con la configuración Google JavaScript Style Guide.</w:t>
+      <w:proofErr w:type="spellStart"/>
+      <w:r>
+        <w:rPr>
+          <w:lang w:val="es-ES"/>
+        </w:rPr>
+        <w:t>ESLint</w:t>
+      </w:r>
+      <w:proofErr w:type="spellEnd"/>
+      <w:r>
+        <w:rPr>
+          <w:lang w:val="es-ES"/>
+        </w:rPr>
+        <w:t xml:space="preserve"> con la configuración Google JavaScript Style Guide.</w:t>
       </w:r>
     </w:p>
     <w:p>
@@ -1058,6 +627,7 @@
         </w:rPr>
         <w:t xml:space="preserve"> y siguiendo el estándar de </w:t>
       </w:r>
+      <w:proofErr w:type="spellStart"/>
       <w:r>
         <w:rPr>
           <w:b/>
@@ -1066,6 +636,7 @@
         </w:rPr>
         <w:t>JSDoc</w:t>
       </w:r>
+      <w:proofErr w:type="spellEnd"/>
       <w:r>
         <w:rPr>
           <w:lang w:val="es-ES"/>
@@ -1114,6 +685,7 @@
         </w:rPr>
         <w:t xml:space="preserve">: </w:t>
       </w:r>
+      <w:proofErr w:type="spellStart"/>
       <w:r>
         <w:rPr>
           <w:rStyle w:val="CdigoHTML"/>
@@ -1124,6 +696,7 @@
         </w:rPr>
         <w:t>snake_case</w:t>
       </w:r>
+      <w:proofErr w:type="spellEnd"/>
       <w:r>
         <w:rPr>
           <w:lang w:val="es-ES"/>
@@ -1168,6 +741,7 @@
         </w:rPr>
         <w:t xml:space="preserve">: Deben comenzar con el prefijo </w:t>
       </w:r>
+      <w:proofErr w:type="spellStart"/>
       <w:r>
         <w:rPr>
           <w:rStyle w:val="CdigoHTML"/>
@@ -1176,14 +750,9 @@
           <w:szCs w:val="24"/>
           <w:lang w:val="es-ES"/>
         </w:rPr>
-        <w:t>tk_</w:t>
-      </w:r>
-      <w:r>
-        <w:rPr>
-          <w:lang w:val="es-ES"/>
-        </w:rPr>
-        <w:t xml:space="preserve"> seguido de </w:t>
-      </w:r>
+        <w:t>tk</w:t>
+      </w:r>
+      <w:proofErr w:type="spellEnd"/>
       <w:r>
         <w:rPr>
           <w:rStyle w:val="CdigoHTML"/>
@@ -1192,14 +761,15 @@
           <w:szCs w:val="24"/>
           <w:lang w:val="es-ES"/>
         </w:rPr>
-        <w:t>snake_case</w:t>
-      </w:r>
-      <w:r>
-        <w:rPr>
-          <w:lang w:val="es-ES"/>
-        </w:rPr>
-        <w:t xml:space="preserve"> o </w:t>
-      </w:r>
+        <w:t>_</w:t>
+      </w:r>
+      <w:r>
+        <w:rPr>
+          <w:lang w:val="es-ES"/>
+        </w:rPr>
+        <w:t xml:space="preserve"> seguido de </w:t>
+      </w:r>
+      <w:proofErr w:type="spellStart"/>
       <w:r>
         <w:rPr>
           <w:rStyle w:val="CdigoHTML"/>
@@ -1208,36 +778,16 @@
           <w:szCs w:val="24"/>
           <w:lang w:val="es-ES"/>
         </w:rPr>
-        <w:t>camelCase</w:t>
-      </w:r>
-      <w:r>
-        <w:rPr>
-          <w:lang w:val="es-ES"/>
-        </w:rPr>
-        <w:t xml:space="preserve"> según el enunciado</w:t>
-      </w:r>
-      <w:r>
-        <w:rPr>
-          <w:lang w:val="es-ES"/>
-        </w:rPr>
-        <w:t xml:space="preserve">, </w:t>
-      </w:r>
-      <w:r>
-        <w:rPr>
-          <w:b/>
-          <w:bCs/>
-          <w:i/>
-          <w:iCs/>
-          <w:lang w:val="es-ES"/>
-        </w:rPr>
-        <w:t>Variables y métodos internos</w:t>
-      </w:r>
-      <w:r>
-        <w:rPr>
-          <w:lang w:val="es-ES"/>
-        </w:rPr>
-        <w:t xml:space="preserve">: </w:t>
-      </w:r>
+        <w:t>snake_case</w:t>
+      </w:r>
+      <w:proofErr w:type="spellEnd"/>
+      <w:r>
+        <w:rPr>
+          <w:lang w:val="es-ES"/>
+        </w:rPr>
+        <w:t xml:space="preserve"> o </w:t>
+      </w:r>
+      <w:proofErr w:type="spellStart"/>
       <w:r>
         <w:rPr>
           <w:rStyle w:val="CdigoHTML"/>
@@ -1248,6 +798,13 @@
         </w:rPr>
         <w:t>camelCase</w:t>
       </w:r>
+      <w:proofErr w:type="spellEnd"/>
+      <w:r>
+        <w:rPr>
+          <w:lang w:val="es-ES"/>
+        </w:rPr>
+        <w:t xml:space="preserve"> según el enunciado</w:t>
+      </w:r>
       <w:r>
         <w:rPr>
           <w:lang w:val="es-ES"/>
@@ -1262,7 +819,7 @@
           <w:iCs/>
           <w:lang w:val="es-ES"/>
         </w:rPr>
-        <w:t>Clases (cuando aplique)</w:t>
+        <w:t>Variables y métodos internos</w:t>
       </w:r>
       <w:r>
         <w:rPr>
@@ -1270,6 +827,7 @@
         </w:rPr>
         <w:t xml:space="preserve">: </w:t>
       </w:r>
+      <w:proofErr w:type="spellStart"/>
       <w:r>
         <w:rPr>
           <w:rStyle w:val="CdigoHTML"/>
@@ -1278,8 +836,43 @@
           <w:szCs w:val="24"/>
           <w:lang w:val="es-ES"/>
         </w:rPr>
+        <w:t>camelCase</w:t>
+      </w:r>
+      <w:proofErr w:type="spellEnd"/>
+      <w:r>
+        <w:rPr>
+          <w:lang w:val="es-ES"/>
+        </w:rPr>
+        <w:t xml:space="preserve">, </w:t>
+      </w:r>
+      <w:r>
+        <w:rPr>
+          <w:b/>
+          <w:bCs/>
+          <w:i/>
+          <w:iCs/>
+          <w:lang w:val="es-ES"/>
+        </w:rPr>
+        <w:t>Clases (cuando aplique)</w:t>
+      </w:r>
+      <w:r>
+        <w:rPr>
+          <w:lang w:val="es-ES"/>
+        </w:rPr>
+        <w:t xml:space="preserve">: </w:t>
+      </w:r>
+      <w:proofErr w:type="spellStart"/>
+      <w:r>
+        <w:rPr>
+          <w:rStyle w:val="CdigoHTML"/>
+          <w:rFonts w:asciiTheme="minorHAnsi" w:eastAsiaTheme="minorHAnsi" w:hAnsiTheme="minorHAnsi" w:cstheme="minorBidi"/>
+          <w:sz w:val="24"/>
+          <w:szCs w:val="24"/>
+          <w:lang w:val="es-ES"/>
+        </w:rPr>
         <w:t>PascalCase</w:t>
       </w:r>
+      <w:proofErr w:type="spellEnd"/>
       <w:r>
         <w:rPr>
           <w:lang w:val="es-ES"/>
@@ -1320,7 +913,43 @@
           <w:bCs/>
           <w:lang w:val="es-ES"/>
         </w:rPr>
-        <w:t>Visual Studio Code (VS Code)</w:t>
+        <w:t xml:space="preserve">Visual Studio </w:t>
+      </w:r>
+      <w:proofErr w:type="spellStart"/>
+      <w:r>
+        <w:rPr>
+          <w:b/>
+          <w:bCs/>
+          <w:lang w:val="es-ES"/>
+        </w:rPr>
+        <w:t>Code</w:t>
+      </w:r>
+      <w:proofErr w:type="spellEnd"/>
+      <w:r>
+        <w:rPr>
+          <w:b/>
+          <w:bCs/>
+          <w:lang w:val="es-ES"/>
+        </w:rPr>
+        <w:t xml:space="preserve"> (VS </w:t>
+      </w:r>
+      <w:proofErr w:type="spellStart"/>
+      <w:r>
+        <w:rPr>
+          <w:b/>
+          <w:bCs/>
+          <w:lang w:val="es-ES"/>
+        </w:rPr>
+        <w:t>Code</w:t>
+      </w:r>
+      <w:proofErr w:type="spellEnd"/>
+      <w:r>
+        <w:rPr>
+          <w:b/>
+          <w:bCs/>
+          <w:lang w:val="es-ES"/>
+        </w:rPr>
+        <w:t>)</w:t>
       </w:r>
       <w:r>
         <w:rPr>
@@ -1328,6 +957,7 @@
         </w:rPr>
         <w:t xml:space="preserve"> con las extensiones de </w:t>
       </w:r>
+      <w:proofErr w:type="spellStart"/>
       <w:r>
         <w:rPr>
           <w:i/>
@@ -1336,12 +966,14 @@
         </w:rPr>
         <w:t>ESLint</w:t>
       </w:r>
+      <w:proofErr w:type="spellEnd"/>
       <w:r>
         <w:rPr>
           <w:lang w:val="es-ES"/>
         </w:rPr>
         <w:t xml:space="preserve"> y </w:t>
       </w:r>
+      <w:proofErr w:type="spellStart"/>
       <w:r>
         <w:rPr>
           <w:i/>
@@ -1350,6 +982,7 @@
         </w:rPr>
         <w:t>Prettier</w:t>
       </w:r>
+      <w:proofErr w:type="spellEnd"/>
       <w:r>
         <w:rPr>
           <w:lang w:val="es-ES"/>
@@ -1360,8 +993,30 @@
         <w:rPr>
           <w:lang w:val="es-ES"/>
         </w:rPr>
-        <w:t>, Cursor, WebStorm, etc</w:t>
-      </w:r>
+        <w:t xml:space="preserve">, Cursor, </w:t>
+      </w:r>
+      <w:proofErr w:type="spellStart"/>
+      <w:r>
+        <w:rPr>
+          <w:lang w:val="es-ES"/>
+        </w:rPr>
+        <w:t>WebStorm</w:t>
+      </w:r>
+      <w:proofErr w:type="spellEnd"/>
+      <w:r>
+        <w:rPr>
+          <w:lang w:val="es-ES"/>
+        </w:rPr>
+        <w:t xml:space="preserve">, </w:t>
+      </w:r>
+      <w:proofErr w:type="spellStart"/>
+      <w:r>
+        <w:rPr>
+          <w:lang w:val="es-ES"/>
+        </w:rPr>
+        <w:t>etc</w:t>
+      </w:r>
+      <w:proofErr w:type="spellEnd"/>
       <w:r>
         <w:rPr>
           <w:lang w:val="es-ES"/>
@@ -1406,7 +1061,21 @@
         <w:rPr>
           <w:lang w:val="es-ES"/>
         </w:rPr>
-        <w:t xml:space="preserve"> node.</w:t>
+        <w:t xml:space="preserve"> </w:t>
+      </w:r>
+      <w:proofErr w:type="spellStart"/>
+      <w:r>
+        <w:rPr>
+          <w:lang w:val="es-ES"/>
+        </w:rPr>
+        <w:t>node</w:t>
+      </w:r>
+      <w:proofErr w:type="spellEnd"/>
+      <w:r>
+        <w:rPr>
+          <w:lang w:val="es-ES"/>
+        </w:rPr>
+        <w:t>.</w:t>
       </w:r>
     </w:p>
     <w:p>
@@ -1425,13 +1094,31 @@
           <w:bCs/>
         </w:rPr>
       </w:pPr>
-      <w:r>
-        <w:rPr>
-          <w:b/>
-          <w:bCs/>
-        </w:rPr>
-        <w:t>Entrega y Evaluación</w:t>
-      </w:r>
+      <w:proofErr w:type="spellStart"/>
+      <w:r>
+        <w:rPr>
+          <w:b/>
+          <w:bCs/>
+        </w:rPr>
+        <w:t>Entrega</w:t>
+      </w:r>
+      <w:proofErr w:type="spellEnd"/>
+      <w:r>
+        <w:rPr>
+          <w:b/>
+          <w:bCs/>
+        </w:rPr>
+        <w:t xml:space="preserve"> y </w:t>
+      </w:r>
+      <w:proofErr w:type="spellStart"/>
+      <w:r>
+        <w:rPr>
+          <w:b/>
+          <w:bCs/>
+        </w:rPr>
+        <w:t>Evaluación</w:t>
+      </w:r>
+      <w:proofErr w:type="spellEnd"/>
     </w:p>
     <w:p>
       <w:pPr>
@@ -1441,8 +1128,29 @@
           <w:numId w:val="8"/>
         </w:numPr>
       </w:pPr>
-      <w:r>
-        <w:t>Entrega en repositorio Git.</w:t>
+      <w:proofErr w:type="spellStart"/>
+      <w:r>
+        <w:t>Entrega</w:t>
+      </w:r>
+      <w:proofErr w:type="spellEnd"/>
+      <w:r>
+        <w:t xml:space="preserve"> </w:t>
+      </w:r>
+      <w:proofErr w:type="spellStart"/>
+      <w:r>
+        <w:t>en</w:t>
+      </w:r>
+      <w:proofErr w:type="spellEnd"/>
+      <w:r>
+        <w:t xml:space="preserve"> </w:t>
+      </w:r>
+      <w:proofErr w:type="spellStart"/>
+      <w:r>
+        <w:t>repositorio</w:t>
+      </w:r>
+      <w:proofErr w:type="spellEnd"/>
+      <w:r>
+        <w:t xml:space="preserve"> Git.</w:t>
       </w:r>
     </w:p>
     <w:p>
@@ -1504,7 +1212,7 @@
           <w:lang w:val="es-ES"/>
         </w:rPr>
       </w:pPr>
-      <w:bookmarkStart w:id="0" w:name="_Toc227989460"/>
+      <w:bookmarkStart w:id="0" w:name="_Toc233887107"/>
       <w:r>
         <w:rPr>
           <w:lang w:val="es-ES"/>
@@ -1616,13 +1324,73 @@
           <w:bCs/>
           <w:lang w:val="es-ES"/>
         </w:rPr>
-        <w:t>Módulo 00: The JS Engine Lab</w:t>
-      </w:r>
-      <w:r>
-        <w:rPr>
-          <w:lang w:val="es-ES"/>
-        </w:rPr>
-        <w:t xml:space="preserve"> es una declaración de intenciones. No vas a empezar dibujando botones en una web; vas a empezar en la soledad de la terminal, enfrentándote a la lógica pura. Vas a aprender a respetar el linter no como un enemigo que te pone trabas, sino como el guardián de tu profesionalidad.</w:t>
+        <w:t xml:space="preserve">Módulo 00: </w:t>
+      </w:r>
+      <w:proofErr w:type="spellStart"/>
+      <w:r>
+        <w:rPr>
+          <w:b/>
+          <w:bCs/>
+          <w:lang w:val="es-ES"/>
+        </w:rPr>
+        <w:t>The</w:t>
+      </w:r>
+      <w:proofErr w:type="spellEnd"/>
+      <w:r>
+        <w:rPr>
+          <w:b/>
+          <w:bCs/>
+          <w:lang w:val="es-ES"/>
+        </w:rPr>
+        <w:t xml:space="preserve"> JS </w:t>
+      </w:r>
+      <w:proofErr w:type="spellStart"/>
+      <w:r>
+        <w:rPr>
+          <w:b/>
+          <w:bCs/>
+          <w:lang w:val="es-ES"/>
+        </w:rPr>
+        <w:t>Engine</w:t>
+      </w:r>
+      <w:proofErr w:type="spellEnd"/>
+      <w:r>
+        <w:rPr>
+          <w:b/>
+          <w:bCs/>
+          <w:lang w:val="es-ES"/>
+        </w:rPr>
+        <w:t xml:space="preserve"> </w:t>
+      </w:r>
+      <w:proofErr w:type="spellStart"/>
+      <w:r>
+        <w:rPr>
+          <w:b/>
+          <w:bCs/>
+          <w:lang w:val="es-ES"/>
+        </w:rPr>
+        <w:t>Lab</w:t>
+      </w:r>
+      <w:proofErr w:type="spellEnd"/>
+      <w:r>
+        <w:rPr>
+          <w:lang w:val="es-ES"/>
+        </w:rPr>
+        <w:t xml:space="preserve"> es una declaración de intenciones. No vas a empezar dibujando botones en una web; vas a empezar en la soledad de la terminal, enfrentándote a la lógica pura. Vas a aprender a respetar el </w:t>
+      </w:r>
+      <w:proofErr w:type="spellStart"/>
+      <w:r>
+        <w:rPr>
+          <w:lang w:val="es-ES"/>
+        </w:rPr>
+        <w:t>linter</w:t>
+      </w:r>
+      <w:proofErr w:type="spellEnd"/>
+      <w:r>
+        <w:rPr>
+          <w:lang w:val="es-ES"/>
+        </w:rPr>
+        <w:t xml:space="preserve"> no como un enemigo que te pone trabas, sino como el guardián de tu profesionalidad.</w:t>
       </w:r>
     </w:p>
     <w:p>
@@ -1636,7 +1404,21 @@
         <w:rPr>
           <w:lang w:val="es-ES"/>
         </w:rPr>
-        <w:t>En la 42, decimos que "aprender a aprender" es la única habilidad que no caduca. JavaScript cambiará, saldrán nuevos frameworks cada lunes y las herramientas evolucionarán, pero la capacidad de entender un sistema desde su base (el motor) te hará invencible ante cualquier cambio tecnológico.</w:t>
+        <w:t xml:space="preserve">En la 42, decimos que "aprender a aprender" es la única habilidad que no caduca. JavaScript cambiará, saldrán nuevos </w:t>
+      </w:r>
+      <w:proofErr w:type="spellStart"/>
+      <w:r>
+        <w:rPr>
+          <w:lang w:val="es-ES"/>
+        </w:rPr>
+        <w:t>frameworks</w:t>
+      </w:r>
+      <w:proofErr w:type="spellEnd"/>
+      <w:r>
+        <w:rPr>
+          <w:lang w:val="es-ES"/>
+        </w:rPr>
+        <w:t xml:space="preserve"> cada lunes y las herramientas evolucionarán, pero la capacidad de entender un sistema desde su base (el motor) te hará invencible ante cualquier cambio tecnológico.</w:t>
       </w:r>
     </w:p>
     <w:p>
@@ -1735,7 +1517,7 @@
           <w:lang w:val="es-ES"/>
         </w:rPr>
       </w:pPr>
-      <w:bookmarkStart w:id="1" w:name="_Toc227989461"/>
+      <w:bookmarkStart w:id="1" w:name="_Toc233887108"/>
       <w:r>
         <w:rPr>
           <w:lang w:val="es-ES"/>
@@ -1786,8 +1568,36 @@
           <w:bCs/>
           <w:lang w:val="es-ES"/>
         </w:rPr>
-        <w:t>Módulo 02: The Data Architect</w:t>
-      </w:r>
+        <w:t xml:space="preserve">Módulo 02: </w:t>
+      </w:r>
+      <w:proofErr w:type="spellStart"/>
+      <w:r>
+        <w:rPr>
+          <w:b/>
+          <w:bCs/>
+          <w:lang w:val="es-ES"/>
+        </w:rPr>
+        <w:t>The</w:t>
+      </w:r>
+      <w:proofErr w:type="spellEnd"/>
+      <w:r>
+        <w:rPr>
+          <w:b/>
+          <w:bCs/>
+          <w:lang w:val="es-ES"/>
+        </w:rPr>
+        <w:t xml:space="preserve"> Data </w:t>
+      </w:r>
+      <w:proofErr w:type="spellStart"/>
+      <w:r>
+        <w:rPr>
+          <w:b/>
+          <w:bCs/>
+          <w:lang w:val="es-ES"/>
+        </w:rPr>
+        <w:t>Architect</w:t>
+      </w:r>
+      <w:proofErr w:type="spellEnd"/>
       <w:r>
         <w:rPr>
           <w:lang w:val="es-ES"/>
@@ -1846,13 +1656,59 @@
           <w:bCs/>
           <w:lang w:val="es-ES"/>
         </w:rPr>
-        <w:t>La Colección (Arrays y Métodos Funcionales):</w:t>
-      </w:r>
-      <w:r>
-        <w:rPr>
-          <w:lang w:val="es-ES"/>
-        </w:rPr>
-        <w:t xml:space="preserve"> Dejarás de usar bucles rudimentarios para procesar información. Dominarás el "trío dinámico" de JavaScript moderno: map, filter y reduce. Estas herramientas te permitirán transformar grandes volúmenes de datos con una precisión quirúrgica y un código limpio.</w:t>
+        <w:t>La Colección (</w:t>
+      </w:r>
+      <w:proofErr w:type="spellStart"/>
+      <w:r>
+        <w:rPr>
+          <w:b/>
+          <w:bCs/>
+          <w:lang w:val="es-ES"/>
+        </w:rPr>
+        <w:t>Arrays</w:t>
+      </w:r>
+      <w:proofErr w:type="spellEnd"/>
+      <w:r>
+        <w:rPr>
+          <w:b/>
+          <w:bCs/>
+          <w:lang w:val="es-ES"/>
+        </w:rPr>
+        <w:t xml:space="preserve"> y Métodos Funcionales):</w:t>
+      </w:r>
+      <w:r>
+        <w:rPr>
+          <w:lang w:val="es-ES"/>
+        </w:rPr>
+        <w:t xml:space="preserve"> Dejarás de usar bucles rudimentarios para procesar información. Dominarás el "trío dinámico" de JavaScript moderno: </w:t>
+      </w:r>
+      <w:proofErr w:type="spellStart"/>
+      <w:r>
+        <w:rPr>
+          <w:lang w:val="es-ES"/>
+        </w:rPr>
+        <w:t>map</w:t>
+      </w:r>
+      <w:proofErr w:type="spellEnd"/>
+      <w:r>
+        <w:rPr>
+          <w:lang w:val="es-ES"/>
+        </w:rPr>
+        <w:t xml:space="preserve">, </w:t>
+      </w:r>
+      <w:proofErr w:type="spellStart"/>
+      <w:r>
+        <w:rPr>
+          <w:lang w:val="es-ES"/>
+        </w:rPr>
+        <w:t>filter</w:t>
+      </w:r>
+      <w:proofErr w:type="spellEnd"/>
+      <w:r>
+        <w:rPr>
+          <w:lang w:val="es-ES"/>
+        </w:rPr>
+        <w:t xml:space="preserve"> y reduce. Estas herramientas te permitirán transformar grandes volúmenes de datos con una precisión quirúrgica y un código limpio.</w:t>
       </w:r>
     </w:p>
     <w:p>
@@ -1902,6 +1758,7 @@
         </w:rPr>
         <w:t xml:space="preserve">Dominar los objetos y las colecciones es lo que te permitirá, en el futuro, entender cómo un clúster de </w:t>
       </w:r>
+      <w:proofErr w:type="spellStart"/>
       <w:r>
         <w:rPr>
           <w:b/>
@@ -1910,6 +1767,7 @@
         </w:rPr>
         <w:t>Kubernetes</w:t>
       </w:r>
+      <w:proofErr w:type="spellEnd"/>
       <w:r>
         <w:rPr>
           <w:lang w:val="es-ES"/>
@@ -1976,13 +1834,31 @@
           <w:bCs/>
         </w:rPr>
       </w:pPr>
-      <w:r>
-        <w:rPr>
-          <w:b/>
-          <w:bCs/>
-        </w:rPr>
-        <w:t>Ejercicio 00: La Cola del Almacén</w:t>
-      </w:r>
+      <w:proofErr w:type="spellStart"/>
+      <w:r>
+        <w:rPr>
+          <w:b/>
+          <w:bCs/>
+        </w:rPr>
+        <w:t>Ejercicio</w:t>
+      </w:r>
+      <w:proofErr w:type="spellEnd"/>
+      <w:r>
+        <w:rPr>
+          <w:b/>
+          <w:bCs/>
+        </w:rPr>
+        <w:t xml:space="preserve"> 00: La Cola del </w:t>
+      </w:r>
+      <w:proofErr w:type="spellStart"/>
+      <w:r>
+        <w:rPr>
+          <w:b/>
+          <w:bCs/>
+        </w:rPr>
+        <w:t>Almacén</w:t>
+      </w:r>
+      <w:proofErr w:type="spellEnd"/>
     </w:p>
     <w:p>
       <w:pPr>
@@ -2006,8 +1882,24 @@
         <w:rPr>
           <w:lang w:val="es-ES"/>
         </w:rPr>
-        <w:t xml:space="preserve"> ft_stock_manager</w:t>
-      </w:r>
+        <w:t xml:space="preserve"> </w:t>
+      </w:r>
+      <w:proofErr w:type="spellStart"/>
+      <w:r>
+        <w:rPr>
+          <w:lang w:val="es-ES"/>
+        </w:rPr>
+        <w:t>ft_stock_</w:t>
+      </w:r>
+      <w:proofErr w:type="gramStart"/>
+      <w:r>
+        <w:rPr>
+          <w:lang w:val="es-ES"/>
+        </w:rPr>
+        <w:t>manager</w:t>
+      </w:r>
+      <w:proofErr w:type="spellEnd"/>
+      <w:proofErr w:type="gramEnd"/>
     </w:p>
     <w:p>
       <w:pPr>
@@ -2034,12 +1926,21 @@
           <w:numId w:val="56"/>
         </w:numPr>
       </w:pPr>
-      <w:r>
-        <w:rPr>
-          <w:b/>
-          <w:bCs/>
-        </w:rPr>
-        <w:t>Archivo:</w:t>
+      <w:proofErr w:type="spellStart"/>
+      <w:r>
+        <w:rPr>
+          <w:b/>
+          <w:bCs/>
+        </w:rPr>
+        <w:t>Archivo</w:t>
+      </w:r>
+      <w:proofErr w:type="spellEnd"/>
+      <w:r>
+        <w:rPr>
+          <w:b/>
+          <w:bCs/>
+        </w:rPr>
+        <w:t>:</w:t>
       </w:r>
       <w:r>
         <w:t xml:space="preserve"> ft_stock_manager.js</w:t>
@@ -2052,12 +1953,37 @@
           <w:numId w:val="56"/>
         </w:numPr>
       </w:pPr>
-      <w:r>
-        <w:rPr>
-          <w:b/>
-          <w:bCs/>
-        </w:rPr>
-        <w:t>Funciones autorizadas:</w:t>
+      <w:proofErr w:type="spellStart"/>
+      <w:r>
+        <w:rPr>
+          <w:b/>
+          <w:bCs/>
+        </w:rPr>
+        <w:t>Funciones</w:t>
+      </w:r>
+      <w:proofErr w:type="spellEnd"/>
+      <w:r>
+        <w:rPr>
+          <w:b/>
+          <w:bCs/>
+        </w:rPr>
+        <w:t xml:space="preserve"> </w:t>
+      </w:r>
+      <w:proofErr w:type="spellStart"/>
+      <w:r>
+        <w:rPr>
+          <w:b/>
+          <w:bCs/>
+        </w:rPr>
+        <w:t>autorizadas</w:t>
+      </w:r>
+      <w:proofErr w:type="spellEnd"/>
+      <w:r>
+        <w:rPr>
+          <w:b/>
+          <w:bCs/>
+        </w:rPr>
+        <w:t>:</w:t>
       </w:r>
       <w:r>
         <w:t xml:space="preserve"> push, pop, shift, unshift.</w:t>
@@ -2110,7 +2036,15 @@
         <w:t xml:space="preserve"> Crea una función que gestione una lista de herramientas. </w:t>
       </w:r>
       <w:r>
-        <w:t>Debe poder:</w:t>
+        <w:t xml:space="preserve">Debe </w:t>
+      </w:r>
+      <w:proofErr w:type="spellStart"/>
+      <w:r>
+        <w:t>poder</w:t>
+      </w:r>
+      <w:proofErr w:type="spellEnd"/>
+      <w:r>
+        <w:t>:</w:t>
       </w:r>
     </w:p>
     <w:p>
@@ -2138,7 +2072,23 @@
         </w:numPr>
       </w:pPr>
       <w:r>
-        <w:t>Sacar la última añadida.</w:t>
+        <w:t xml:space="preserve">Sacar la </w:t>
+      </w:r>
+      <w:proofErr w:type="spellStart"/>
+      <w:r>
+        <w:t>última</w:t>
+      </w:r>
+      <w:proofErr w:type="spellEnd"/>
+      <w:r>
+        <w:t xml:space="preserve"> </w:t>
+      </w:r>
+      <w:proofErr w:type="spellStart"/>
+      <w:r>
+        <w:t>añadida</w:t>
+      </w:r>
+      <w:proofErr w:type="spellEnd"/>
+      <w:r>
+        <w:t>.</w:t>
       </w:r>
     </w:p>
     <w:p>
@@ -2203,7 +2153,7 @@
     <w:p>
       <w:r>
         <w:pict w14:anchorId="44A365EA">
-          <v:rect id="_x0000_i1067" style="width:0;height:1.5pt" o:hralign="center" o:hrstd="t" o:hr="t" fillcolor="#a0a0a0" stroked="f"/>
+          <v:rect id="_x0000_i1027" style="width:0;height:1.5pt" o:hralign="center" o:hrstd="t" o:hr="t" fillcolor="#a0a0a0" stroked="f"/>
         </w:pict>
       </w:r>
     </w:p>
@@ -2214,12 +2164,21 @@
           <w:bCs/>
         </w:rPr>
       </w:pPr>
-      <w:r>
-        <w:rPr>
-          <w:b/>
-          <w:bCs/>
-        </w:rPr>
-        <w:t>Ejercicio 01: El Paseo del Inspector</w:t>
+      <w:proofErr w:type="spellStart"/>
+      <w:r>
+        <w:rPr>
+          <w:b/>
+          <w:bCs/>
+        </w:rPr>
+        <w:t>Ejercicio</w:t>
+      </w:r>
+      <w:proofErr w:type="spellEnd"/>
+      <w:r>
+        <w:rPr>
+          <w:b/>
+          <w:bCs/>
+        </w:rPr>
+        <w:t xml:space="preserve"> 01: El Paseo del Inspector</w:t>
       </w:r>
     </w:p>
     <w:p>
@@ -2244,8 +2203,16 @@
         <w:rPr>
           <w:lang w:val="es-ES"/>
         </w:rPr>
-        <w:t xml:space="preserve"> ft_list_inspector</w:t>
-      </w:r>
+        <w:t xml:space="preserve"> </w:t>
+      </w:r>
+      <w:proofErr w:type="spellStart"/>
+      <w:r>
+        <w:rPr>
+          <w:lang w:val="es-ES"/>
+        </w:rPr>
+        <w:t>ft_list_inspector</w:t>
+      </w:r>
+      <w:proofErr w:type="spellEnd"/>
     </w:p>
     <w:p>
       <w:pPr>
@@ -2272,12 +2239,21 @@
           <w:numId w:val="57"/>
         </w:numPr>
       </w:pPr>
-      <w:r>
-        <w:rPr>
-          <w:b/>
-          <w:bCs/>
-        </w:rPr>
-        <w:t>Archivo:</w:t>
+      <w:proofErr w:type="spellStart"/>
+      <w:r>
+        <w:rPr>
+          <w:b/>
+          <w:bCs/>
+        </w:rPr>
+        <w:t>Archivo</w:t>
+      </w:r>
+      <w:proofErr w:type="spellEnd"/>
+      <w:r>
+        <w:rPr>
+          <w:b/>
+          <w:bCs/>
+        </w:rPr>
+        <w:t>:</w:t>
       </w:r>
       <w:r>
         <w:t xml:space="preserve"> ft_list_inspector.js</w:t>
@@ -2290,15 +2266,48 @@
           <w:numId w:val="57"/>
         </w:numPr>
       </w:pPr>
-      <w:r>
-        <w:rPr>
-          <w:b/>
-          <w:bCs/>
-        </w:rPr>
-        <w:t>Funciones autorizadas:</w:t>
-      </w:r>
-      <w:r>
-        <w:t xml:space="preserve"> forEach.</w:t>
+      <w:proofErr w:type="spellStart"/>
+      <w:r>
+        <w:rPr>
+          <w:b/>
+          <w:bCs/>
+        </w:rPr>
+        <w:t>Funciones</w:t>
+      </w:r>
+      <w:proofErr w:type="spellEnd"/>
+      <w:r>
+        <w:rPr>
+          <w:b/>
+          <w:bCs/>
+        </w:rPr>
+        <w:t xml:space="preserve"> </w:t>
+      </w:r>
+      <w:proofErr w:type="spellStart"/>
+      <w:r>
+        <w:rPr>
+          <w:b/>
+          <w:bCs/>
+        </w:rPr>
+        <w:t>autorizadas</w:t>
+      </w:r>
+      <w:proofErr w:type="spellEnd"/>
+      <w:r>
+        <w:rPr>
+          <w:b/>
+          <w:bCs/>
+        </w:rPr>
+        <w:t>:</w:t>
+      </w:r>
+      <w:r>
+        <w:t xml:space="preserve"> </w:t>
+      </w:r>
+      <w:proofErr w:type="spellStart"/>
+      <w:r>
+        <w:t>forEach</w:t>
+      </w:r>
+      <w:proofErr w:type="spellEnd"/>
+      <w:r>
+        <w:t>.</w:t>
       </w:r>
     </w:p>
     <w:p>
@@ -2323,7 +2332,21 @@
         <w:rPr>
           <w:lang w:val="es-ES"/>
         </w:rPr>
-        <w:t xml:space="preserve"> Iteración básica sin usar el bucle for clásico.</w:t>
+        <w:t xml:space="preserve"> Iteración básica sin usar el bucle </w:t>
+      </w:r>
+      <w:proofErr w:type="spellStart"/>
+      <w:r>
+        <w:rPr>
+          <w:lang w:val="es-ES"/>
+        </w:rPr>
+        <w:t>for</w:t>
+      </w:r>
+      <w:proofErr w:type="spellEnd"/>
+      <w:r>
+        <w:rPr>
+          <w:lang w:val="es-ES"/>
+        </w:rPr>
+        <w:t xml:space="preserve"> clásico.</w:t>
       </w:r>
     </w:p>
     <w:p>
@@ -2348,7 +2371,49 @@
         <w:rPr>
           <w:lang w:val="es-ES"/>
         </w:rPr>
-        <w:t xml:space="preserve"> Recibe un array de nombres de plantas. Debe imprimir en consola cada nombre precedido por su índice y el mensaje: [Index X]: Plant Name.</w:t>
+        <w:t xml:space="preserve"> Recibe un array de nombres de plantas. Debe imprimir en consola cada nombre precedido por su índice y el mensaje: [</w:t>
+      </w:r>
+      <w:proofErr w:type="spellStart"/>
+      <w:r>
+        <w:rPr>
+          <w:lang w:val="es-ES"/>
+        </w:rPr>
+        <w:t>Index</w:t>
+      </w:r>
+      <w:proofErr w:type="spellEnd"/>
+      <w:r>
+        <w:rPr>
+          <w:lang w:val="es-ES"/>
+        </w:rPr>
+        <w:t xml:space="preserve"> X]: </w:t>
+      </w:r>
+      <w:proofErr w:type="spellStart"/>
+      <w:r>
+        <w:rPr>
+          <w:lang w:val="es-ES"/>
+        </w:rPr>
+        <w:t>Plant</w:t>
+      </w:r>
+      <w:proofErr w:type="spellEnd"/>
+      <w:r>
+        <w:rPr>
+          <w:lang w:val="es-ES"/>
+        </w:rPr>
+        <w:t xml:space="preserve"> </w:t>
+      </w:r>
+      <w:proofErr w:type="spellStart"/>
+      <w:r>
+        <w:rPr>
+          <w:lang w:val="es-ES"/>
+        </w:rPr>
+        <w:t>Name</w:t>
+      </w:r>
+      <w:proofErr w:type="spellEnd"/>
+      <w:r>
+        <w:rPr>
+          <w:lang w:val="es-ES"/>
+        </w:rPr>
+        <w:t>.</w:t>
       </w:r>
     </w:p>
     <w:p>
@@ -2379,7 +2444,7 @@
     <w:p>
       <w:r>
         <w:pict w14:anchorId="4B89AAE8">
-          <v:rect id="_x0000_i1068" style="width:0;height:1.5pt" o:hralign="center" o:hrstd="t" o:hr="t" fillcolor="#a0a0a0" stroked="f"/>
+          <v:rect id="_x0000_i1028" style="width:0;height:1.5pt" o:hralign="center" o:hrstd="t" o:hr="t" fillcolor="#a0a0a0" stroked="f"/>
         </w:pict>
       </w:r>
     </w:p>
@@ -2390,13 +2455,31 @@
           <w:bCs/>
         </w:rPr>
       </w:pPr>
-      <w:r>
-        <w:rPr>
-          <w:b/>
-          <w:bCs/>
-        </w:rPr>
-        <w:t>Ejercicio 02: El Laboratorio de Mutaciones</w:t>
-      </w:r>
+      <w:proofErr w:type="spellStart"/>
+      <w:r>
+        <w:rPr>
+          <w:b/>
+          <w:bCs/>
+        </w:rPr>
+        <w:t>Ejercicio</w:t>
+      </w:r>
+      <w:proofErr w:type="spellEnd"/>
+      <w:r>
+        <w:rPr>
+          <w:b/>
+          <w:bCs/>
+        </w:rPr>
+        <w:t xml:space="preserve"> 02: El Laboratorio de </w:t>
+      </w:r>
+      <w:proofErr w:type="spellStart"/>
+      <w:r>
+        <w:rPr>
+          <w:b/>
+          <w:bCs/>
+        </w:rPr>
+        <w:t>Mutaciones</w:t>
+      </w:r>
+      <w:proofErr w:type="spellEnd"/>
     </w:p>
     <w:p>
       <w:pPr>
@@ -2421,8 +2504,16 @@
         <w:rPr>
           <w:lang w:val="es-ES"/>
         </w:rPr>
-        <w:t xml:space="preserve"> ft_map_growth</w:t>
-      </w:r>
+        <w:t xml:space="preserve"> </w:t>
+      </w:r>
+      <w:proofErr w:type="spellStart"/>
+      <w:r>
+        <w:rPr>
+          <w:lang w:val="es-ES"/>
+        </w:rPr>
+        <w:t>ft_map_growth</w:t>
+      </w:r>
+      <w:proofErr w:type="spellEnd"/>
     </w:p>
     <w:p>
       <w:pPr>
@@ -2449,12 +2540,21 @@
           <w:numId w:val="58"/>
         </w:numPr>
       </w:pPr>
-      <w:r>
-        <w:rPr>
-          <w:b/>
-          <w:bCs/>
-        </w:rPr>
-        <w:t>Archivo:</w:t>
+      <w:proofErr w:type="spellStart"/>
+      <w:r>
+        <w:rPr>
+          <w:b/>
+          <w:bCs/>
+        </w:rPr>
+        <w:t>Archivo</w:t>
+      </w:r>
+      <w:proofErr w:type="spellEnd"/>
+      <w:r>
+        <w:rPr>
+          <w:b/>
+          <w:bCs/>
+        </w:rPr>
+        <w:t>:</w:t>
       </w:r>
       <w:r>
         <w:t xml:space="preserve"> ft_map_growth.js</w:t>
@@ -2467,12 +2567,37 @@
           <w:numId w:val="58"/>
         </w:numPr>
       </w:pPr>
-      <w:r>
-        <w:rPr>
-          <w:b/>
-          <w:bCs/>
-        </w:rPr>
-        <w:t>Funciones autorizadas:</w:t>
+      <w:proofErr w:type="spellStart"/>
+      <w:r>
+        <w:rPr>
+          <w:b/>
+          <w:bCs/>
+        </w:rPr>
+        <w:t>Funciones</w:t>
+      </w:r>
+      <w:proofErr w:type="spellEnd"/>
+      <w:r>
+        <w:rPr>
+          <w:b/>
+          <w:bCs/>
+        </w:rPr>
+        <w:t xml:space="preserve"> </w:t>
+      </w:r>
+      <w:proofErr w:type="spellStart"/>
+      <w:r>
+        <w:rPr>
+          <w:b/>
+          <w:bCs/>
+        </w:rPr>
+        <w:t>autorizadas</w:t>
+      </w:r>
+      <w:proofErr w:type="spellEnd"/>
+      <w:r>
+        <w:rPr>
+          <w:b/>
+          <w:bCs/>
+        </w:rPr>
+        <w:t>:</w:t>
       </w:r>
       <w:r>
         <w:t xml:space="preserve"> map.</w:t>
@@ -2556,7 +2681,7 @@
     <w:p>
       <w:r>
         <w:pict w14:anchorId="7B6E6B82">
-          <v:rect id="_x0000_i1069" style="width:0;height:1.5pt" o:hralign="center" o:hrstd="t" o:hr="t" fillcolor="#a0a0a0" stroked="f"/>
+          <v:rect id="_x0000_i1029" style="width:0;height:1.5pt" o:hralign="center" o:hrstd="t" o:hr="t" fillcolor="#a0a0a0" stroked="f"/>
         </w:pict>
       </w:r>
     </w:p>
@@ -2567,13 +2692,47 @@
           <w:bCs/>
         </w:rPr>
       </w:pPr>
-      <w:r>
-        <w:rPr>
-          <w:b/>
-          <w:bCs/>
-        </w:rPr>
-        <w:t>Ejercicio 03: La Criba del Cosechador</w:t>
-      </w:r>
+      <w:proofErr w:type="spellStart"/>
+      <w:r>
+        <w:rPr>
+          <w:b/>
+          <w:bCs/>
+        </w:rPr>
+        <w:t>Ejercicio</w:t>
+      </w:r>
+      <w:proofErr w:type="spellEnd"/>
+      <w:r>
+        <w:rPr>
+          <w:b/>
+          <w:bCs/>
+        </w:rPr>
+        <w:t xml:space="preserve"> 03: La </w:t>
+      </w:r>
+      <w:proofErr w:type="spellStart"/>
+      <w:r>
+        <w:rPr>
+          <w:b/>
+          <w:bCs/>
+        </w:rPr>
+        <w:t>Criba</w:t>
+      </w:r>
+      <w:proofErr w:type="spellEnd"/>
+      <w:r>
+        <w:rPr>
+          <w:b/>
+          <w:bCs/>
+        </w:rPr>
+        <w:t xml:space="preserve"> del </w:t>
+      </w:r>
+      <w:proofErr w:type="spellStart"/>
+      <w:r>
+        <w:rPr>
+          <w:b/>
+          <w:bCs/>
+        </w:rPr>
+        <w:t>Cosechador</w:t>
+      </w:r>
+      <w:proofErr w:type="spellEnd"/>
     </w:p>
     <w:p>
       <w:pPr>
@@ -2597,8 +2756,16 @@
         <w:rPr>
           <w:lang w:val="es-ES"/>
         </w:rPr>
-        <w:t xml:space="preserve"> ft_filter_ripe</w:t>
-      </w:r>
+        <w:t xml:space="preserve"> </w:t>
+      </w:r>
+      <w:proofErr w:type="spellStart"/>
+      <w:r>
+        <w:rPr>
+          <w:lang w:val="es-ES"/>
+        </w:rPr>
+        <w:t>ft_filter_ripe</w:t>
+      </w:r>
+      <w:proofErr w:type="spellEnd"/>
     </w:p>
     <w:p>
       <w:pPr>
@@ -2625,12 +2792,21 @@
           <w:numId w:val="59"/>
         </w:numPr>
       </w:pPr>
-      <w:r>
-        <w:rPr>
-          <w:b/>
-          <w:bCs/>
-        </w:rPr>
-        <w:t>Archivo:</w:t>
+      <w:proofErr w:type="spellStart"/>
+      <w:r>
+        <w:rPr>
+          <w:b/>
+          <w:bCs/>
+        </w:rPr>
+        <w:t>Archivo</w:t>
+      </w:r>
+      <w:proofErr w:type="spellEnd"/>
+      <w:r>
+        <w:rPr>
+          <w:b/>
+          <w:bCs/>
+        </w:rPr>
+        <w:t>:</w:t>
       </w:r>
       <w:r>
         <w:t xml:space="preserve"> ft_filter_ripe.js</w:t>
@@ -2643,12 +2819,37 @@
           <w:numId w:val="59"/>
         </w:numPr>
       </w:pPr>
-      <w:r>
-        <w:rPr>
-          <w:b/>
-          <w:bCs/>
-        </w:rPr>
-        <w:t>Funciones autorizadas:</w:t>
+      <w:proofErr w:type="spellStart"/>
+      <w:r>
+        <w:rPr>
+          <w:b/>
+          <w:bCs/>
+        </w:rPr>
+        <w:t>Funciones</w:t>
+      </w:r>
+      <w:proofErr w:type="spellEnd"/>
+      <w:r>
+        <w:rPr>
+          <w:b/>
+          <w:bCs/>
+        </w:rPr>
+        <w:t xml:space="preserve"> </w:t>
+      </w:r>
+      <w:proofErr w:type="spellStart"/>
+      <w:r>
+        <w:rPr>
+          <w:b/>
+          <w:bCs/>
+        </w:rPr>
+        <w:t>autorizadas</w:t>
+      </w:r>
+      <w:proofErr w:type="spellEnd"/>
+      <w:r>
+        <w:rPr>
+          <w:b/>
+          <w:bCs/>
+        </w:rPr>
+        <w:t>:</w:t>
       </w:r>
       <w:r>
         <w:t xml:space="preserve"> filter.</w:t>
@@ -2701,7 +2902,71 @@
         <w:rPr>
           <w:lang w:val="es-ES"/>
         </w:rPr>
-        <w:t xml:space="preserve"> Recibe un array de objetos { name: string, sugarLevel: number }. Devuelve solo aquellos cuyo nivel de azúcar sea superior a 10.</w:t>
+        <w:t xml:space="preserve"> Recibe un array de objetos </w:t>
+      </w:r>
+      <w:proofErr w:type="gramStart"/>
+      <w:r>
+        <w:rPr>
+          <w:lang w:val="es-ES"/>
+        </w:rPr>
+        <w:t xml:space="preserve">{ </w:t>
+      </w:r>
+      <w:proofErr w:type="spellStart"/>
+      <w:r>
+        <w:rPr>
+          <w:lang w:val="es-ES"/>
+        </w:rPr>
+        <w:t>name</w:t>
+      </w:r>
+      <w:proofErr w:type="spellEnd"/>
+      <w:proofErr w:type="gramEnd"/>
+      <w:r>
+        <w:rPr>
+          <w:lang w:val="es-ES"/>
+        </w:rPr>
+        <w:t xml:space="preserve">: </w:t>
+      </w:r>
+      <w:proofErr w:type="spellStart"/>
+      <w:r>
+        <w:rPr>
+          <w:lang w:val="es-ES"/>
+        </w:rPr>
+        <w:t>string</w:t>
+      </w:r>
+      <w:proofErr w:type="spellEnd"/>
+      <w:r>
+        <w:rPr>
+          <w:lang w:val="es-ES"/>
+        </w:rPr>
+        <w:t xml:space="preserve">, </w:t>
+      </w:r>
+      <w:proofErr w:type="spellStart"/>
+      <w:r>
+        <w:rPr>
+          <w:lang w:val="es-ES"/>
+        </w:rPr>
+        <w:t>sugarLevel</w:t>
+      </w:r>
+      <w:proofErr w:type="spellEnd"/>
+      <w:r>
+        <w:rPr>
+          <w:lang w:val="es-ES"/>
+        </w:rPr>
+        <w:t xml:space="preserve">: </w:t>
+      </w:r>
+      <w:proofErr w:type="spellStart"/>
+      <w:r>
+        <w:rPr>
+          <w:lang w:val="es-ES"/>
+        </w:rPr>
+        <w:t>number</w:t>
+      </w:r>
+      <w:proofErr w:type="spellEnd"/>
+      <w:r>
+        <w:rPr>
+          <w:lang w:val="es-ES"/>
+        </w:rPr>
+        <w:t xml:space="preserve"> }. Devuelve solo aquellos cuyo nivel de azúcar sea superior a 10.</w:t>
       </w:r>
     </w:p>
     <w:p>
@@ -2732,7 +2997,7 @@
     <w:p>
       <w:r>
         <w:pict w14:anchorId="561F4346">
-          <v:rect id="_x0000_i1070" style="width:0;height:1.5pt" o:hralign="center" o:hrstd="t" o:hr="t" fillcolor="#a0a0a0" stroked="f"/>
+          <v:rect id="_x0000_i1030" style="width:0;height:1.5pt" o:hralign="center" o:hrstd="t" o:hr="t" fillcolor="#a0a0a0" stroked="f"/>
         </w:pict>
       </w:r>
     </w:p>
@@ -2743,12 +3008,21 @@
           <w:bCs/>
         </w:rPr>
       </w:pPr>
-      <w:r>
-        <w:rPr>
-          <w:b/>
-          <w:bCs/>
-        </w:rPr>
-        <w:t>Ejercicio 04: La Cosecha Total</w:t>
+      <w:proofErr w:type="spellStart"/>
+      <w:r>
+        <w:rPr>
+          <w:b/>
+          <w:bCs/>
+        </w:rPr>
+        <w:t>Ejercicio</w:t>
+      </w:r>
+      <w:proofErr w:type="spellEnd"/>
+      <w:r>
+        <w:rPr>
+          <w:b/>
+          <w:bCs/>
+        </w:rPr>
+        <w:t xml:space="preserve"> 04: La Cosecha Total</w:t>
       </w:r>
     </w:p>
     <w:p>
@@ -2773,8 +3047,16 @@
         <w:rPr>
           <w:lang w:val="es-ES"/>
         </w:rPr>
-        <w:t xml:space="preserve"> ft_total_weight</w:t>
-      </w:r>
+        <w:t xml:space="preserve"> </w:t>
+      </w:r>
+      <w:proofErr w:type="spellStart"/>
+      <w:r>
+        <w:rPr>
+          <w:lang w:val="es-ES"/>
+        </w:rPr>
+        <w:t>ft_total_weight</w:t>
+      </w:r>
+      <w:proofErr w:type="spellEnd"/>
     </w:p>
     <w:p>
       <w:pPr>
@@ -2801,12 +3083,21 @@
           <w:numId w:val="60"/>
         </w:numPr>
       </w:pPr>
-      <w:r>
-        <w:rPr>
-          <w:b/>
-          <w:bCs/>
-        </w:rPr>
-        <w:t>Archivo:</w:t>
+      <w:proofErr w:type="spellStart"/>
+      <w:r>
+        <w:rPr>
+          <w:b/>
+          <w:bCs/>
+        </w:rPr>
+        <w:t>Archivo</w:t>
+      </w:r>
+      <w:proofErr w:type="spellEnd"/>
+      <w:r>
+        <w:rPr>
+          <w:b/>
+          <w:bCs/>
+        </w:rPr>
+        <w:t>:</w:t>
       </w:r>
       <w:r>
         <w:t xml:space="preserve"> ft_total_weight.js</w:t>
@@ -2819,12 +3110,37 @@
           <w:numId w:val="60"/>
         </w:numPr>
       </w:pPr>
-      <w:r>
-        <w:rPr>
-          <w:b/>
-          <w:bCs/>
-        </w:rPr>
-        <w:t>Funciones autorizadas:</w:t>
+      <w:proofErr w:type="spellStart"/>
+      <w:r>
+        <w:rPr>
+          <w:b/>
+          <w:bCs/>
+        </w:rPr>
+        <w:t>Funciones</w:t>
+      </w:r>
+      <w:proofErr w:type="spellEnd"/>
+      <w:r>
+        <w:rPr>
+          <w:b/>
+          <w:bCs/>
+        </w:rPr>
+        <w:t xml:space="preserve"> </w:t>
+      </w:r>
+      <w:proofErr w:type="spellStart"/>
+      <w:r>
+        <w:rPr>
+          <w:b/>
+          <w:bCs/>
+        </w:rPr>
+        <w:t>autorizadas</w:t>
+      </w:r>
+      <w:proofErr w:type="spellEnd"/>
+      <w:r>
+        <w:rPr>
+          <w:b/>
+          <w:bCs/>
+        </w:rPr>
+        <w:t>:</w:t>
       </w:r>
       <w:r>
         <w:t xml:space="preserve"> reduce.</w:t>
@@ -2853,7 +3169,21 @@
         <w:rPr>
           <w:lang w:val="es-ES"/>
         </w:rPr>
-        <w:t xml:space="preserve"> Reducción de una lista a un único valor. Es el método más potente de los arrays.</w:t>
+        <w:t xml:space="preserve"> Reducción de una lista a un único valor. Es el método más potente de los </w:t>
+      </w:r>
+      <w:proofErr w:type="spellStart"/>
+      <w:r>
+        <w:rPr>
+          <w:lang w:val="es-ES"/>
+        </w:rPr>
+        <w:t>arrays</w:t>
+      </w:r>
+      <w:proofErr w:type="spellEnd"/>
+      <w:r>
+        <w:rPr>
+          <w:lang w:val="es-ES"/>
+        </w:rPr>
+        <w:t>.</w:t>
       </w:r>
     </w:p>
     <w:p>
@@ -2943,7 +3273,43 @@
           <w:bCs/>
           <w:lang w:val="es-ES"/>
         </w:rPr>
-        <w:t>: El Localizador de Precisión (Find &amp; Destructuring)</w:t>
+        <w:t>: El Localizador de Precisión (</w:t>
+      </w:r>
+      <w:proofErr w:type="spellStart"/>
+      <w:r>
+        <w:rPr>
+          <w:b/>
+          <w:bCs/>
+          <w:lang w:val="es-ES"/>
+        </w:rPr>
+        <w:t>Find</w:t>
+      </w:r>
+      <w:proofErr w:type="spellEnd"/>
+      <w:r>
+        <w:rPr>
+          <w:b/>
+          <w:bCs/>
+          <w:lang w:val="es-ES"/>
+        </w:rPr>
+        <w:t xml:space="preserve"> &amp; </w:t>
+      </w:r>
+      <w:proofErr w:type="spellStart"/>
+      <w:r>
+        <w:rPr>
+          <w:b/>
+          <w:bCs/>
+          <w:lang w:val="es-ES"/>
+        </w:rPr>
+        <w:t>Destructuring</w:t>
+      </w:r>
+      <w:proofErr w:type="spellEnd"/>
+      <w:r>
+        <w:rPr>
+          <w:b/>
+          <w:bCs/>
+          <w:lang w:val="es-ES"/>
+        </w:rPr>
+        <w:t>)</w:t>
       </w:r>
     </w:p>
     <w:p>
@@ -2968,8 +3334,16 @@
         <w:rPr>
           <w:lang w:val="es-ES"/>
         </w:rPr>
-        <w:t xml:space="preserve"> ft_find_and_extract</w:t>
-      </w:r>
+        <w:t xml:space="preserve"> </w:t>
+      </w:r>
+      <w:proofErr w:type="spellStart"/>
+      <w:r>
+        <w:rPr>
+          <w:lang w:val="es-ES"/>
+        </w:rPr>
+        <w:t>ft_find_and_extract</w:t>
+      </w:r>
+      <w:proofErr w:type="spellEnd"/>
     </w:p>
     <w:p>
       <w:pPr>
@@ -2996,12 +3370,21 @@
           <w:numId w:val="62"/>
         </w:numPr>
       </w:pPr>
-      <w:r>
-        <w:rPr>
-          <w:b/>
-          <w:bCs/>
-        </w:rPr>
-        <w:t>Archivo:</w:t>
+      <w:proofErr w:type="spellStart"/>
+      <w:r>
+        <w:rPr>
+          <w:b/>
+          <w:bCs/>
+        </w:rPr>
+        <w:t>Archivo</w:t>
+      </w:r>
+      <w:proofErr w:type="spellEnd"/>
+      <w:r>
+        <w:rPr>
+          <w:b/>
+          <w:bCs/>
+        </w:rPr>
+        <w:t>:</w:t>
       </w:r>
       <w:r>
         <w:t xml:space="preserve"> ft_find_and_extract.js</w:t>
@@ -3014,15 +3397,48 @@
           <w:numId w:val="62"/>
         </w:numPr>
       </w:pPr>
-      <w:r>
-        <w:rPr>
-          <w:b/>
-          <w:bCs/>
-        </w:rPr>
-        <w:t>Funciones autorizadas:</w:t>
-      </w:r>
-      <w:r>
-        <w:t xml:space="preserve"> find, Array destructuring ([a, b] = array).</w:t>
+      <w:proofErr w:type="spellStart"/>
+      <w:r>
+        <w:rPr>
+          <w:b/>
+          <w:bCs/>
+        </w:rPr>
+        <w:t>Funciones</w:t>
+      </w:r>
+      <w:proofErr w:type="spellEnd"/>
+      <w:r>
+        <w:rPr>
+          <w:b/>
+          <w:bCs/>
+        </w:rPr>
+        <w:t xml:space="preserve"> </w:t>
+      </w:r>
+      <w:proofErr w:type="spellStart"/>
+      <w:r>
+        <w:rPr>
+          <w:b/>
+          <w:bCs/>
+        </w:rPr>
+        <w:t>autorizadas</w:t>
+      </w:r>
+      <w:proofErr w:type="spellEnd"/>
+      <w:r>
+        <w:rPr>
+          <w:b/>
+          <w:bCs/>
+        </w:rPr>
+        <w:t>:</w:t>
+      </w:r>
+      <w:r>
+        <w:t xml:space="preserve"> find, Array </w:t>
+      </w:r>
+      <w:proofErr w:type="spellStart"/>
+      <w:r>
+        <w:t>destructuring</w:t>
+      </w:r>
+      <w:proofErr w:type="spellEnd"/>
+      <w:r>
+        <w:t xml:space="preserve"> ([a, b] = array).</w:t>
       </w:r>
     </w:p>
     <w:p>
@@ -3072,7 +3488,21 @@
         <w:rPr>
           <w:lang w:val="es-ES"/>
         </w:rPr>
-        <w:t xml:space="preserve"> Trabajarás con un sistema de sensores de un nodo de Kubernetes.</w:t>
+        <w:t xml:space="preserve"> Trabajarás con un sistema de sensores de un nodo de </w:t>
+      </w:r>
+      <w:proofErr w:type="spellStart"/>
+      <w:r>
+        <w:rPr>
+          <w:lang w:val="es-ES"/>
+        </w:rPr>
+        <w:t>Kubernetes</w:t>
+      </w:r>
+      <w:proofErr w:type="spellEnd"/>
+      <w:r>
+        <w:rPr>
+          <w:lang w:val="es-ES"/>
+        </w:rPr>
+        <w:t>.</w:t>
       </w:r>
     </w:p>
     <w:p>
@@ -3089,7 +3519,49 @@
         <w:rPr>
           <w:lang w:val="es-ES"/>
         </w:rPr>
-        <w:t>Recibes un array de objetos: [{id: "sn-01", type: "temp"}, {id: "sn-02", type: "hum"}].</w:t>
+        <w:t xml:space="preserve">Recibes un array de objetos: [{id: "sn-01", </w:t>
+      </w:r>
+      <w:proofErr w:type="spellStart"/>
+      <w:r>
+        <w:rPr>
+          <w:lang w:val="es-ES"/>
+        </w:rPr>
+        <w:t>type</w:t>
+      </w:r>
+      <w:proofErr w:type="spellEnd"/>
+      <w:r>
+        <w:rPr>
+          <w:lang w:val="es-ES"/>
+        </w:rPr>
+        <w:t>: "</w:t>
+      </w:r>
+      <w:proofErr w:type="spellStart"/>
+      <w:r>
+        <w:rPr>
+          <w:lang w:val="es-ES"/>
+        </w:rPr>
+        <w:t>temp</w:t>
+      </w:r>
+      <w:proofErr w:type="spellEnd"/>
+      <w:r>
+        <w:rPr>
+          <w:lang w:val="es-ES"/>
+        </w:rPr>
+        <w:t xml:space="preserve">"}, {id: "sn-02", </w:t>
+      </w:r>
+      <w:proofErr w:type="spellStart"/>
+      <w:r>
+        <w:rPr>
+          <w:lang w:val="es-ES"/>
+        </w:rPr>
+        <w:t>type</w:t>
+      </w:r>
+      <w:proofErr w:type="spellEnd"/>
+      <w:r>
+        <w:rPr>
+          <w:lang w:val="es-ES"/>
+        </w:rPr>
+        <w:t>: "hum"}].</w:t>
       </w:r>
     </w:p>
     <w:p>
@@ -3102,11 +3574,27 @@
           <w:lang w:val="es-ES"/>
         </w:rPr>
       </w:pPr>
-      <w:r>
-        <w:rPr>
-          <w:lang w:val="es-ES"/>
-        </w:rPr>
-        <w:t>Usa .find() para localizar el objeto con el id que se te pase por parámetro.</w:t>
+      <w:proofErr w:type="gramStart"/>
+      <w:r>
+        <w:rPr>
+          <w:lang w:val="es-ES"/>
+        </w:rPr>
+        <w:t>Usa .</w:t>
+      </w:r>
+      <w:proofErr w:type="spellStart"/>
+      <w:r>
+        <w:rPr>
+          <w:lang w:val="es-ES"/>
+        </w:rPr>
+        <w:t>find</w:t>
+      </w:r>
+      <w:proofErr w:type="spellEnd"/>
+      <w:proofErr w:type="gramEnd"/>
+      <w:r>
+        <w:rPr>
+          <w:lang w:val="es-ES"/>
+        </w:rPr>
+        <w:t>() para localizar el objeto con el id que se te pase por parámetro.</w:t>
       </w:r>
     </w:p>
     <w:p>
@@ -3137,7 +3625,21 @@
         <w:rPr>
           <w:lang w:val="es-ES"/>
         </w:rPr>
-        <w:t xml:space="preserve"> para extraer solo el id y el type en variables separadas.</w:t>
+        <w:t xml:space="preserve"> para extraer solo el id y el </w:t>
+      </w:r>
+      <w:proofErr w:type="spellStart"/>
+      <w:r>
+        <w:rPr>
+          <w:lang w:val="es-ES"/>
+        </w:rPr>
+        <w:t>type</w:t>
+      </w:r>
+      <w:proofErr w:type="spellEnd"/>
+      <w:r>
+        <w:rPr>
+          <w:lang w:val="es-ES"/>
+        </w:rPr>
+        <w:t xml:space="preserve"> en variables separadas.</w:t>
       </w:r>
     </w:p>
     <w:p>
@@ -3162,7 +3664,79 @@
         <w:rPr>
           <w:lang w:val="es-ES"/>
         </w:rPr>
-        <w:t xml:space="preserve"> El ejercicio también recibe una lista de "Alertas" (un array de 3 strings). Usa desestructuración para capturar la primera alerta como critical, la segunda como warning y el resto mételo en un array llamado others usando el operador rest (...).</w:t>
+        <w:t xml:space="preserve"> El ejercicio también recibe una lista de "Alertas" (un array de 3 </w:t>
+      </w:r>
+      <w:proofErr w:type="spellStart"/>
+      <w:r>
+        <w:rPr>
+          <w:lang w:val="es-ES"/>
+        </w:rPr>
+        <w:t>strings</w:t>
+      </w:r>
+      <w:proofErr w:type="spellEnd"/>
+      <w:r>
+        <w:rPr>
+          <w:lang w:val="es-ES"/>
+        </w:rPr>
+        <w:t xml:space="preserve">). Usa desestructuración para capturar la primera alerta como </w:t>
+      </w:r>
+      <w:proofErr w:type="spellStart"/>
+      <w:r>
+        <w:rPr>
+          <w:lang w:val="es-ES"/>
+        </w:rPr>
+        <w:t>critical</w:t>
+      </w:r>
+      <w:proofErr w:type="spellEnd"/>
+      <w:r>
+        <w:rPr>
+          <w:lang w:val="es-ES"/>
+        </w:rPr>
+        <w:t xml:space="preserve">, la segunda como </w:t>
+      </w:r>
+      <w:proofErr w:type="spellStart"/>
+      <w:proofErr w:type="gramStart"/>
+      <w:r>
+        <w:rPr>
+          <w:lang w:val="es-ES"/>
+        </w:rPr>
+        <w:t>warning</w:t>
+      </w:r>
+      <w:proofErr w:type="spellEnd"/>
+      <w:proofErr w:type="gramEnd"/>
+      <w:r>
+        <w:rPr>
+          <w:lang w:val="es-ES"/>
+        </w:rPr>
+        <w:t xml:space="preserve"> y el resto mételo en un array llamado </w:t>
+      </w:r>
+      <w:proofErr w:type="spellStart"/>
+      <w:r>
+        <w:rPr>
+          <w:lang w:val="es-ES"/>
+        </w:rPr>
+        <w:t>others</w:t>
+      </w:r>
+      <w:proofErr w:type="spellEnd"/>
+      <w:r>
+        <w:rPr>
+          <w:lang w:val="es-ES"/>
+        </w:rPr>
+        <w:t xml:space="preserve"> usando el operador </w:t>
+      </w:r>
+      <w:proofErr w:type="spellStart"/>
+      <w:r>
+        <w:rPr>
+          <w:lang w:val="es-ES"/>
+        </w:rPr>
+        <w:t>rest</w:t>
+      </w:r>
+      <w:proofErr w:type="spellEnd"/>
+      <w:r>
+        <w:rPr>
+          <w:lang w:val="es-ES"/>
+        </w:rPr>
+        <w:t xml:space="preserve"> (...).</w:t>
       </w:r>
     </w:p>
     <w:p>
@@ -3187,7 +3761,21 @@
         <w:rPr>
           <w:lang w:val="es-ES"/>
         </w:rPr>
-        <w:t xml:space="preserve"> Porque evita escribir array[0], array[1], etc., haciendo el código mucho más legible y menos propenso a errores.</w:t>
+        <w:t xml:space="preserve"> Porque evita escribir </w:t>
+      </w:r>
+      <w:proofErr w:type="gramStart"/>
+      <w:r>
+        <w:rPr>
+          <w:lang w:val="es-ES"/>
+        </w:rPr>
+        <w:t>array[</w:t>
+      </w:r>
+      <w:proofErr w:type="gramEnd"/>
+      <w:r>
+        <w:rPr>
+          <w:lang w:val="es-ES"/>
+        </w:rPr>
+        <w:t>0], array[1], etc., haciendo el código mucho más legible y menos propenso a errores.</w:t>
       </w:r>
     </w:p>
     <w:p>
@@ -3212,14 +3800,106 @@
         <w:rPr>
           <w:lang w:val="es-ES"/>
         </w:rPr>
-        <w:t xml:space="preserve"> Un objeto que resuma la búsqueda: { foundId: "sn-01", mainAlert: "High Temp", secondaryAlerts: ["Fan Fail", "Power Low"] }.</w:t>
+        <w:t xml:space="preserve"> Un objeto que resuma la búsqueda: </w:t>
+      </w:r>
+      <w:proofErr w:type="gramStart"/>
+      <w:r>
+        <w:rPr>
+          <w:lang w:val="es-ES"/>
+        </w:rPr>
+        <w:t xml:space="preserve">{ </w:t>
+      </w:r>
+      <w:proofErr w:type="spellStart"/>
+      <w:r>
+        <w:rPr>
+          <w:lang w:val="es-ES"/>
+        </w:rPr>
+        <w:t>foundId</w:t>
+      </w:r>
+      <w:proofErr w:type="spellEnd"/>
+      <w:proofErr w:type="gramEnd"/>
+      <w:r>
+        <w:rPr>
+          <w:lang w:val="es-ES"/>
+        </w:rPr>
+        <w:t xml:space="preserve">: "sn-01", </w:t>
+      </w:r>
+      <w:proofErr w:type="spellStart"/>
+      <w:r>
+        <w:rPr>
+          <w:lang w:val="es-ES"/>
+        </w:rPr>
+        <w:t>mainAlert</w:t>
+      </w:r>
+      <w:proofErr w:type="spellEnd"/>
+      <w:r>
+        <w:rPr>
+          <w:lang w:val="es-ES"/>
+        </w:rPr>
+        <w:t xml:space="preserve">: "High </w:t>
+      </w:r>
+      <w:proofErr w:type="spellStart"/>
+      <w:r>
+        <w:rPr>
+          <w:lang w:val="es-ES"/>
+        </w:rPr>
+        <w:t>Temp</w:t>
+      </w:r>
+      <w:proofErr w:type="spellEnd"/>
+      <w:r>
+        <w:rPr>
+          <w:lang w:val="es-ES"/>
+        </w:rPr>
+        <w:t xml:space="preserve">", </w:t>
+      </w:r>
+      <w:proofErr w:type="spellStart"/>
+      <w:r>
+        <w:rPr>
+          <w:lang w:val="es-ES"/>
+        </w:rPr>
+        <w:t>secondaryAlerts</w:t>
+      </w:r>
+      <w:proofErr w:type="spellEnd"/>
+      <w:r>
+        <w:rPr>
+          <w:lang w:val="es-ES"/>
+        </w:rPr>
+        <w:t xml:space="preserve">: ["Fan </w:t>
+      </w:r>
+      <w:proofErr w:type="spellStart"/>
+      <w:r>
+        <w:rPr>
+          <w:lang w:val="es-ES"/>
+        </w:rPr>
+        <w:t>Fail</w:t>
+      </w:r>
+      <w:proofErr w:type="spellEnd"/>
+      <w:r>
+        <w:rPr>
+          <w:lang w:val="es-ES"/>
+        </w:rPr>
+        <w:t>", "</w:t>
+      </w:r>
+      <w:proofErr w:type="spellStart"/>
+      <w:r>
+        <w:rPr>
+          <w:lang w:val="es-ES"/>
+        </w:rPr>
+        <w:t>Power</w:t>
+      </w:r>
+      <w:proofErr w:type="spellEnd"/>
+      <w:r>
+        <w:rPr>
+          <w:lang w:val="es-ES"/>
+        </w:rPr>
+        <w:t xml:space="preserve"> Low"] }.</w:t>
       </w:r>
     </w:p>
     <w:p>
       <w:r>
         <w:lastRenderedPageBreak/>
         <w:pict w14:anchorId="0864C7BF">
-          <v:rect id="_x0000_i1071" style="width:0;height:1.5pt" o:hralign="center" o:hrstd="t" o:hr="t" fillcolor="#a0a0a0" stroked="f"/>
+          <v:rect id="_x0000_i1031" style="width:0;height:1.5pt" o:hralign="center" o:hrstd="t" o:hr="t" fillcolor="#a0a0a0" stroked="f"/>
         </w:pict>
       </w:r>
     </w:p>
@@ -3296,12 +3976,21 @@
           <w:numId w:val="61"/>
         </w:numPr>
       </w:pPr>
-      <w:r>
-        <w:rPr>
-          <w:b/>
-          <w:bCs/>
-        </w:rPr>
-        <w:t>Archivo:</w:t>
+      <w:proofErr w:type="spellStart"/>
+      <w:r>
+        <w:rPr>
+          <w:b/>
+          <w:bCs/>
+        </w:rPr>
+        <w:t>Archivo</w:t>
+      </w:r>
+      <w:proofErr w:type="spellEnd"/>
+      <w:r>
+        <w:rPr>
+          <w:b/>
+          <w:bCs/>
+        </w:rPr>
+        <w:t>:</w:t>
       </w:r>
       <w:r>
         <w:t xml:space="preserve"> ft_k8s_scheduler.js</w:t>
@@ -3329,7 +4018,49 @@
         <w:rPr>
           <w:lang w:val="es-ES"/>
         </w:rPr>
-        <w:t xml:space="preserve"> map, filter, length.</w:t>
+        <w:t xml:space="preserve"> </w:t>
+      </w:r>
+      <w:proofErr w:type="spellStart"/>
+      <w:r>
+        <w:rPr>
+          <w:lang w:val="es-ES"/>
+        </w:rPr>
+        <w:t>map</w:t>
+      </w:r>
+      <w:proofErr w:type="spellEnd"/>
+      <w:r>
+        <w:rPr>
+          <w:lang w:val="es-ES"/>
+        </w:rPr>
+        <w:t xml:space="preserve">, </w:t>
+      </w:r>
+      <w:proofErr w:type="spellStart"/>
+      <w:r>
+        <w:rPr>
+          <w:lang w:val="es-ES"/>
+        </w:rPr>
+        <w:t>filter</w:t>
+      </w:r>
+      <w:proofErr w:type="spellEnd"/>
+      <w:r>
+        <w:rPr>
+          <w:lang w:val="es-ES"/>
+        </w:rPr>
+        <w:t xml:space="preserve">, </w:t>
+      </w:r>
+      <w:proofErr w:type="spellStart"/>
+      <w:r>
+        <w:rPr>
+          <w:lang w:val="es-ES"/>
+        </w:rPr>
+        <w:t>length</w:t>
+      </w:r>
+      <w:proofErr w:type="spellEnd"/>
+      <w:r>
+        <w:rPr>
+          <w:lang w:val="es-ES"/>
+        </w:rPr>
+        <w:t>.</w:t>
       </w:r>
     </w:p>
     <w:p>
@@ -3354,7 +4085,21 @@
         <w:rPr>
           <w:lang w:val="es-ES"/>
         </w:rPr>
-        <w:t xml:space="preserve"> Aplicar lógica de arrays para gestionar infraestructura.</w:t>
+        <w:t xml:space="preserve"> Aplicar lógica de </w:t>
+      </w:r>
+      <w:proofErr w:type="spellStart"/>
+      <w:r>
+        <w:rPr>
+          <w:lang w:val="es-ES"/>
+        </w:rPr>
+        <w:t>arrays</w:t>
+      </w:r>
+      <w:proofErr w:type="spellEnd"/>
+      <w:r>
+        <w:rPr>
+          <w:lang w:val="es-ES"/>
+        </w:rPr>
+        <w:t xml:space="preserve"> para gestionar infraestructura.</w:t>
       </w:r>
     </w:p>
     <w:p>
@@ -3379,7 +4124,49 @@
         <w:rPr>
           <w:lang w:val="es-ES"/>
         </w:rPr>
-        <w:t xml:space="preserve"> En Kubernetes, un "Scheduler" decide dónde poner los Pods.</w:t>
+        <w:t xml:space="preserve"> En </w:t>
+      </w:r>
+      <w:proofErr w:type="spellStart"/>
+      <w:r>
+        <w:rPr>
+          <w:lang w:val="es-ES"/>
+        </w:rPr>
+        <w:t>Kubernetes</w:t>
+      </w:r>
+      <w:proofErr w:type="spellEnd"/>
+      <w:r>
+        <w:rPr>
+          <w:lang w:val="es-ES"/>
+        </w:rPr>
+        <w:t>, un "</w:t>
+      </w:r>
+      <w:proofErr w:type="spellStart"/>
+      <w:r>
+        <w:rPr>
+          <w:lang w:val="es-ES"/>
+        </w:rPr>
+        <w:t>Scheduler</w:t>
+      </w:r>
+      <w:proofErr w:type="spellEnd"/>
+      <w:r>
+        <w:rPr>
+          <w:lang w:val="es-ES"/>
+        </w:rPr>
+        <w:t xml:space="preserve">" decide dónde poner los </w:t>
+      </w:r>
+      <w:proofErr w:type="spellStart"/>
+      <w:r>
+        <w:rPr>
+          <w:lang w:val="es-ES"/>
+        </w:rPr>
+        <w:t>Pods</w:t>
+      </w:r>
+      <w:proofErr w:type="spellEnd"/>
+      <w:r>
+        <w:rPr>
+          <w:lang w:val="es-ES"/>
+        </w:rPr>
+        <w:t>.</w:t>
       </w:r>
     </w:p>
     <w:p>
@@ -3396,7 +4183,71 @@
         <w:rPr>
           <w:lang w:val="es-ES"/>
         </w:rPr>
-        <w:t>Recibe un array de objetos "Nodos": [{ name: "Node1", cpuFree: 20 }, { name: "Node2", cpuFree: 60 }].</w:t>
+        <w:t xml:space="preserve">Recibe un array de objetos "Nodos": </w:t>
+      </w:r>
+      <w:proofErr w:type="gramStart"/>
+      <w:r>
+        <w:rPr>
+          <w:lang w:val="es-ES"/>
+        </w:rPr>
+        <w:t xml:space="preserve">[{ </w:t>
+      </w:r>
+      <w:proofErr w:type="spellStart"/>
+      <w:r>
+        <w:rPr>
+          <w:lang w:val="es-ES"/>
+        </w:rPr>
+        <w:t>name</w:t>
+      </w:r>
+      <w:proofErr w:type="spellEnd"/>
+      <w:proofErr w:type="gramEnd"/>
+      <w:r>
+        <w:rPr>
+          <w:lang w:val="es-ES"/>
+        </w:rPr>
+        <w:t xml:space="preserve">: "Node1", </w:t>
+      </w:r>
+      <w:proofErr w:type="spellStart"/>
+      <w:r>
+        <w:rPr>
+          <w:lang w:val="es-ES"/>
+        </w:rPr>
+        <w:t>cpuFree</w:t>
+      </w:r>
+      <w:proofErr w:type="spellEnd"/>
+      <w:r>
+        <w:rPr>
+          <w:lang w:val="es-ES"/>
+        </w:rPr>
+        <w:t xml:space="preserve">: 20 }, { </w:t>
+      </w:r>
+      <w:proofErr w:type="spellStart"/>
+      <w:r>
+        <w:rPr>
+          <w:lang w:val="es-ES"/>
+        </w:rPr>
+        <w:t>name</w:t>
+      </w:r>
+      <w:proofErr w:type="spellEnd"/>
+      <w:r>
+        <w:rPr>
+          <w:lang w:val="es-ES"/>
+        </w:rPr>
+        <w:t xml:space="preserve">: "Node2", </w:t>
+      </w:r>
+      <w:proofErr w:type="spellStart"/>
+      <w:r>
+        <w:rPr>
+          <w:lang w:val="es-ES"/>
+        </w:rPr>
+        <w:t>cpuFree</w:t>
+      </w:r>
+      <w:proofErr w:type="spellEnd"/>
+      <w:r>
+        <w:rPr>
+          <w:lang w:val="es-ES"/>
+        </w:rPr>
+        <w:t>: 60 }].</w:t>
       </w:r>
     </w:p>
     <w:p>
@@ -3427,7 +4278,21 @@
         <w:rPr>
           <w:lang w:val="es-ES"/>
         </w:rPr>
-        <w:t xml:space="preserve"> los nodos que tengan menos de 50 de cpuFree.</w:t>
+        <w:t xml:space="preserve"> los nodos que tengan menos de 50 de </w:t>
+      </w:r>
+      <w:proofErr w:type="spellStart"/>
+      <w:r>
+        <w:rPr>
+          <w:lang w:val="es-ES"/>
+        </w:rPr>
+        <w:t>cpuFree</w:t>
+      </w:r>
+      <w:proofErr w:type="spellEnd"/>
+      <w:r>
+        <w:rPr>
+          <w:lang w:val="es-ES"/>
+        </w:rPr>
+        <w:t>.</w:t>
       </w:r>
     </w:p>
     <w:p>
@@ -3452,7 +4317,25 @@
           <w:bCs/>
           <w:lang w:val="es-ES"/>
         </w:rPr>
-        <w:t>transforma (map)</w:t>
+        <w:t>transforma (</w:t>
+      </w:r>
+      <w:proofErr w:type="spellStart"/>
+      <w:r>
+        <w:rPr>
+          <w:b/>
+          <w:bCs/>
+          <w:lang w:val="es-ES"/>
+        </w:rPr>
+        <w:t>map</w:t>
+      </w:r>
+      <w:proofErr w:type="spellEnd"/>
+      <w:r>
+        <w:rPr>
+          <w:b/>
+          <w:bCs/>
+          <w:lang w:val="es-ES"/>
+        </w:rPr>
+        <w:t>)</w:t>
       </w:r>
       <w:r>
         <w:rPr>
@@ -12497,6 +13380,7 @@
   <w:style w:type="character" w:default="1" w:styleId="Fuentedeprrafopredeter">
     <w:name w:val="Default Paragraph Font"/>
     <w:uiPriority w:val="1"/>
+    <w:semiHidden/>
     <w:unhideWhenUsed/>
   </w:style>
   <w:style w:type="table" w:default="1" w:styleId="Tablanormal">

</xml_diff>